<commit_message>
Isolate PHPUnit to u_tromb_test, treat own fleet as virtual contractor, and improve ag-Grid UX.
Route tests through .env.testing/u_tromb_test so schema drops no longer wipe the dev database. Exclude «Собственный парк» from own-company lists while keeping fleet bindings. Restore horizontal grid scroll, persist filter models, and reorganize print templates under public/change/Шаблоны.

Co-authored-by: Cursor <cursoragent@cursor.com>
</commit_message>
<xml_diff>
--- a/public/change/Заявка с заказчиком РФ.docx
+++ b/public/change/Заявка с заказчиком РФ.docx
@@ -2,807 +2,1165 @@
 <file path=word/document.xml><?xml version="1.0" encoding="utf-8"?>
 <w:document xmlns:wpc="http://schemas.microsoft.com/office/word/2010/wordprocessingCanvas" xmlns:cx="http://schemas.microsoft.com/office/drawing/2014/chartex" xmlns:cx1="http://schemas.microsoft.com/office/drawing/2015/9/8/chartex" xmlns:cx2="http://schemas.microsoft.com/office/drawing/2015/10/21/chartex" xmlns:cx3="http://schemas.microsoft.com/office/drawing/2016/5/9/chartex" xmlns:cx4="http://schemas.microsoft.com/office/drawing/2016/5/10/chartex" xmlns:cx5="http://schemas.microsoft.com/office/drawing/2016/5/11/chartex" xmlns:cx6="http://schemas.microsoft.com/office/drawing/2016/5/12/chartex" xmlns:cx7="http://schemas.microsoft.com/office/drawing/2016/5/13/chartex" xmlns:cx8="http://schemas.microsoft.com/office/drawing/2016/5/14/chartex" xmlns:mc="http://schemas.openxmlformats.org/markup-compatibility/2006" xmlns:aink="http://schemas.microsoft.com/office/drawing/2016/ink" xmlns:am3d="http://schemas.microsoft.com/office/drawing/2017/model3d" xmlns:o="urn:schemas-microsoft-com:office:office" xmlns:oel="http://schemas.microsoft.com/office/2019/extlst" xmlns:r="http://schemas.openxmlformats.org/officeDocument/2006/relationships" xmlns:m="http://schemas.openxmlformats.org/officeDocument/2006/math" xmlns:v="urn:schemas-microsoft-com:vml" xmlns:wp14="http://schemas.microsoft.com/office/word/2010/wordprocessingDrawing" xmlns:wp="http://schemas.openxmlformats.org/drawingml/2006/wordprocessingDrawing" xmlns:w10="urn:schemas-microsoft-com:office:word" xmlns:w="http://schemas.openxmlformats.org/wordprocessingml/2006/main" xmlns:w14="http://schemas.microsoft.com/office/word/2010/wordml" xmlns:w15="http://schemas.microsoft.com/office/word/2012/wordml" xmlns:w16cex="http://schemas.microsoft.com/office/word/2018/wordml/cex" xmlns:w16cid="http://schemas.microsoft.com/office/word/2016/wordml/cid" xmlns:w16="http://schemas.microsoft.com/office/word/2018/wordml" xmlns:w16sdtdh="http://schemas.microsoft.com/office/word/2020/wordml/sdtdatahash" xmlns:w16se="http://schemas.microsoft.com/office/word/2015/wordml/symex" xmlns:wpg="http://schemas.microsoft.com/office/word/2010/wordprocessingGroup" xmlns:wpi="http://schemas.microsoft.com/office/word/2010/wordprocessingInk" xmlns:wne="http://schemas.microsoft.com/office/word/2006/wordml" xmlns:wps="http://schemas.microsoft.com/office/word/2010/wordprocessingShape" mc:Ignorable="w14 w15 w16se w16cid w16 w16cex w16sdtdh wp14">
   <w:body>
+    <w:tbl>
+      <w:tblPr>
+        <w:tblStyle w:val="a8"/>
+        <w:tblW w:w="11058" w:type="dxa"/>
+        <w:tblInd w:w="-5" w:type="dxa"/>
+        <w:tblBorders>
+          <w:top w:val="none" w:sz="0" w:space="0" w:color="auto"/>
+          <w:left w:val="none" w:sz="0" w:space="0" w:color="auto"/>
+          <w:bottom w:val="none" w:sz="0" w:space="0" w:color="auto"/>
+          <w:right w:val="none" w:sz="0" w:space="0" w:color="auto"/>
+          <w:insideH w:val="none" w:sz="0" w:space="0" w:color="auto"/>
+          <w:insideV w:val="none" w:sz="0" w:space="0" w:color="auto"/>
+        </w:tblBorders>
+        <w:tblLook w:val="04A0" w:firstRow="1" w:lastRow="0" w:firstColumn="1" w:lastColumn="0" w:noHBand="0" w:noVBand="1"/>
+      </w:tblPr>
+      <w:tblGrid>
+        <w:gridCol w:w="10"/>
+        <w:gridCol w:w="2433"/>
+        <w:gridCol w:w="539"/>
+        <w:gridCol w:w="1985"/>
+        <w:gridCol w:w="2835"/>
+        <w:gridCol w:w="136"/>
+        <w:gridCol w:w="45"/>
+        <w:gridCol w:w="381"/>
+        <w:gridCol w:w="2277"/>
+        <w:gridCol w:w="417"/>
+      </w:tblGrid>
+      <w:tr>
+        <w:tc>
+          <w:tcPr>
+            <w:tcW w:w="7938" w:type="dxa"/>
+            <w:gridSpan w:val="6"/>
+          </w:tcPr>
+          <w:p>
+            <w:pPr>
+              <w:pStyle w:val="a9"/>
+              <w:jc w:val="both"/>
+              <w:rPr>
+                <w:sz w:val="20"/>
+                <w:szCs w:val="20"/>
+              </w:rPr>
+            </w:pPr>
+            <w:bookmarkStart w:id="0" w:name="_Hlk230986977"/>
+          </w:p>
+        </w:tc>
+        <w:tc>
+          <w:tcPr>
+            <w:tcW w:w="426" w:type="dxa"/>
+            <w:gridSpan w:val="2"/>
+          </w:tcPr>
+          <w:p>
+            <w:pPr>
+              <w:pStyle w:val="a9"/>
+              <w:jc w:val="right"/>
+              <w:rPr>
+                <w:sz w:val="20"/>
+                <w:szCs w:val="20"/>
+                <w:lang w:val="fr-FR"/>
+              </w:rPr>
+            </w:pPr>
+          </w:p>
+        </w:tc>
+        <w:tc>
+          <w:tcPr>
+            <w:tcW w:w="2694" w:type="dxa"/>
+            <w:gridSpan w:val="2"/>
+            <w:vMerge w:val="restart"/>
+          </w:tcPr>
+          <w:p>
+            <w:pPr>
+              <w:pStyle w:val="a9"/>
+              <w:jc w:val="right"/>
+              <w:rPr>
+                <w:sz w:val="20"/>
+                <w:szCs w:val="20"/>
+              </w:rPr>
+            </w:pPr>
+            <w:r>
+              <w:rPr>
+                <w:sz w:val="20"/>
+                <w:szCs w:val="20"/>
+                <w:lang w:val="fr-FR"/>
+              </w:rPr>
+              <w:t>${document_verification_qr}</w:t>
+            </w:r>
+          </w:p>
+        </w:tc>
+      </w:tr>
+      <w:tr>
+        <w:tc>
+          <w:tcPr>
+            <w:tcW w:w="7938" w:type="dxa"/>
+            <w:gridSpan w:val="6"/>
+          </w:tcPr>
+          <w:p>
+            <w:pPr>
+              <w:pStyle w:val="a9"/>
+              <w:jc w:val="both"/>
+              <w:rPr>
+                <w:b/>
+                <w:bCs/>
+                <w:i/>
+                <w:iCs/>
+                <w:sz w:val="20"/>
+                <w:szCs w:val="20"/>
+              </w:rPr>
+            </w:pPr>
+          </w:p>
+        </w:tc>
+        <w:tc>
+          <w:tcPr>
+            <w:tcW w:w="426" w:type="dxa"/>
+            <w:gridSpan w:val="2"/>
+          </w:tcPr>
+          <w:p>
+            <w:pPr>
+              <w:pStyle w:val="a9"/>
+              <w:jc w:val="right"/>
+            </w:pPr>
+          </w:p>
+        </w:tc>
+        <w:tc>
+          <w:tcPr>
+            <w:tcW w:w="2694" w:type="dxa"/>
+            <w:gridSpan w:val="2"/>
+            <w:vMerge/>
+          </w:tcPr>
+          <w:p>
+            <w:pPr>
+              <w:pStyle w:val="a9"/>
+              <w:jc w:val="right"/>
+            </w:pPr>
+          </w:p>
+        </w:tc>
+      </w:tr>
+      <w:tr>
+        <w:tc>
+          <w:tcPr>
+            <w:tcW w:w="7938" w:type="dxa"/>
+            <w:gridSpan w:val="6"/>
+            <w:vMerge w:val="restart"/>
+          </w:tcPr>
+          <w:p>
+            <w:pPr>
+              <w:pStyle w:val="a9"/>
+              <w:jc w:val="both"/>
+              <w:rPr>
+                <w:b/>
+                <w:bCs/>
+                <w:i/>
+                <w:iCs/>
+                <w:sz w:val="20"/>
+                <w:szCs w:val="20"/>
+              </w:rPr>
+            </w:pPr>
+            <w:r>
+              <w:rPr>
+                <w:b/>
+                <w:bCs/>
+                <w:i/>
+                <w:iCs/>
+                <w:sz w:val="20"/>
+                <w:szCs w:val="20"/>
+              </w:rPr>
+              <w:t>Настоящая Заявка является поручением Экспедитору в соответствии с Договором транспортной экспедиции (публичная оферта), размещенным по адресу:</w:t>
+            </w:r>
+            <w:r>
+              <w:rPr>
+                <w:b/>
+                <w:bCs/>
+                <w:i/>
+                <w:iCs/>
+                <w:sz w:val="20"/>
+                <w:szCs w:val="20"/>
+              </w:rPr>
+              <w:t xml:space="preserve"> </w:t>
+            </w:r>
+            <w:hyperlink r:id="rId7" w:history="1">
+              <w:r>
+                <w:rPr>
+                  <w:rStyle w:val="a3"/>
+                  <w:b/>
+                  <w:bCs/>
+                  <w:i/>
+                  <w:iCs/>
+                  <w:sz w:val="20"/>
+                  <w:szCs w:val="20"/>
+                </w:rPr>
+                <w:t>https://avtoaliyans.ru/sla/documents/customer-offer</w:t>
+              </w:r>
+            </w:hyperlink>
+            <w:r>
+              <w:rPr>
+                <w:b/>
+                <w:bCs/>
+                <w:i/>
+                <w:iCs/>
+                <w:sz w:val="20"/>
+                <w:szCs w:val="20"/>
+              </w:rPr>
+              <w:t xml:space="preserve"> </w:t>
+            </w:r>
+            <w:r>
+              <w:rPr>
+                <w:b/>
+                <w:bCs/>
+                <w:i/>
+                <w:iCs/>
+                <w:sz w:val="20"/>
+                <w:szCs w:val="20"/>
+              </w:rPr>
+              <w:t>Акцептом Заявки со стороны Заказчика является направление подтверждения или оплата услуг Экспедитора.</w:t>
+            </w:r>
+          </w:p>
+        </w:tc>
+        <w:tc>
+          <w:tcPr>
+            <w:tcW w:w="426" w:type="dxa"/>
+            <w:gridSpan w:val="2"/>
+          </w:tcPr>
+          <w:p>
+            <w:pPr>
+              <w:pStyle w:val="a9"/>
+              <w:jc w:val="right"/>
+            </w:pPr>
+          </w:p>
+        </w:tc>
+        <w:tc>
+          <w:tcPr>
+            <w:tcW w:w="2694" w:type="dxa"/>
+            <w:gridSpan w:val="2"/>
+            <w:vMerge/>
+          </w:tcPr>
+          <w:p>
+            <w:pPr>
+              <w:pStyle w:val="a9"/>
+              <w:jc w:val="right"/>
+            </w:pPr>
+          </w:p>
+        </w:tc>
+      </w:tr>
+      <w:tr>
+        <w:tc>
+          <w:tcPr>
+            <w:tcW w:w="7938" w:type="dxa"/>
+            <w:gridSpan w:val="6"/>
+            <w:vMerge/>
+          </w:tcPr>
+          <w:p>
+            <w:pPr>
+              <w:pStyle w:val="a9"/>
+              <w:jc w:val="both"/>
+              <w:rPr>
+                <w:b/>
+                <w:bCs/>
+                <w:i/>
+                <w:iCs/>
+                <w:sz w:val="20"/>
+                <w:szCs w:val="20"/>
+              </w:rPr>
+            </w:pPr>
+          </w:p>
+        </w:tc>
+        <w:tc>
+          <w:tcPr>
+            <w:tcW w:w="426" w:type="dxa"/>
+            <w:gridSpan w:val="2"/>
+          </w:tcPr>
+          <w:p>
+            <w:pPr>
+              <w:pStyle w:val="a9"/>
+              <w:jc w:val="right"/>
+            </w:pPr>
+          </w:p>
+        </w:tc>
+        <w:tc>
+          <w:tcPr>
+            <w:tcW w:w="2694" w:type="dxa"/>
+            <w:gridSpan w:val="2"/>
+            <w:vMerge/>
+          </w:tcPr>
+          <w:p>
+            <w:pPr>
+              <w:pStyle w:val="a9"/>
+              <w:jc w:val="right"/>
+            </w:pPr>
+          </w:p>
+        </w:tc>
+      </w:tr>
+      <w:tr>
+        <w:tc>
+          <w:tcPr>
+            <w:tcW w:w="7938" w:type="dxa"/>
+            <w:gridSpan w:val="6"/>
+          </w:tcPr>
+          <w:p>
+            <w:pPr>
+              <w:pStyle w:val="a9"/>
+              <w:jc w:val="both"/>
+              <w:rPr>
+                <w:b/>
+                <w:bCs/>
+                <w:i/>
+                <w:iCs/>
+                <w:sz w:val="20"/>
+                <w:szCs w:val="20"/>
+              </w:rPr>
+            </w:pPr>
+          </w:p>
+        </w:tc>
+        <w:tc>
+          <w:tcPr>
+            <w:tcW w:w="426" w:type="dxa"/>
+            <w:gridSpan w:val="2"/>
+          </w:tcPr>
+          <w:p>
+            <w:pPr>
+              <w:pStyle w:val="a9"/>
+              <w:jc w:val="right"/>
+            </w:pPr>
+          </w:p>
+        </w:tc>
+        <w:tc>
+          <w:tcPr>
+            <w:tcW w:w="2694" w:type="dxa"/>
+            <w:gridSpan w:val="2"/>
+            <w:vMerge/>
+          </w:tcPr>
+          <w:p>
+            <w:pPr>
+              <w:pStyle w:val="a9"/>
+              <w:jc w:val="right"/>
+            </w:pPr>
+          </w:p>
+        </w:tc>
+      </w:tr>
+      <w:tr>
+        <w:tc>
+          <w:tcPr>
+            <w:tcW w:w="7938" w:type="dxa"/>
+            <w:gridSpan w:val="6"/>
+          </w:tcPr>
+          <w:p>
+            <w:pPr>
+              <w:pStyle w:val="a9"/>
+              <w:jc w:val="both"/>
+              <w:rPr>
+                <w:b/>
+                <w:bCs/>
+                <w:i/>
+                <w:iCs/>
+                <w:sz w:val="20"/>
+                <w:szCs w:val="20"/>
+              </w:rPr>
+            </w:pPr>
+          </w:p>
+        </w:tc>
+        <w:tc>
+          <w:tcPr>
+            <w:tcW w:w="426" w:type="dxa"/>
+            <w:gridSpan w:val="2"/>
+          </w:tcPr>
+          <w:p>
+            <w:pPr>
+              <w:pStyle w:val="a9"/>
+              <w:jc w:val="right"/>
+            </w:pPr>
+          </w:p>
+        </w:tc>
+        <w:tc>
+          <w:tcPr>
+            <w:tcW w:w="2694" w:type="dxa"/>
+            <w:gridSpan w:val="2"/>
+            <w:vMerge/>
+          </w:tcPr>
+          <w:p>
+            <w:pPr>
+              <w:pStyle w:val="a9"/>
+              <w:jc w:val="right"/>
+            </w:pPr>
+          </w:p>
+        </w:tc>
+      </w:tr>
+      <w:tr>
+        <w:tc>
+          <w:tcPr>
+            <w:tcW w:w="7938" w:type="dxa"/>
+            <w:gridSpan w:val="6"/>
+          </w:tcPr>
+          <w:p>
+            <w:pPr>
+              <w:pStyle w:val="a9"/>
+              <w:jc w:val="both"/>
+              <w:rPr>
+                <w:b/>
+                <w:bCs/>
+                <w:i/>
+                <w:iCs/>
+                <w:sz w:val="20"/>
+                <w:szCs w:val="20"/>
+              </w:rPr>
+            </w:pPr>
+          </w:p>
+        </w:tc>
+        <w:tc>
+          <w:tcPr>
+            <w:tcW w:w="426" w:type="dxa"/>
+            <w:gridSpan w:val="2"/>
+          </w:tcPr>
+          <w:p>
+            <w:pPr>
+              <w:pStyle w:val="a9"/>
+              <w:jc w:val="right"/>
+            </w:pPr>
+          </w:p>
+        </w:tc>
+        <w:tc>
+          <w:tcPr>
+            <w:tcW w:w="2694" w:type="dxa"/>
+            <w:gridSpan w:val="2"/>
+          </w:tcPr>
+          <w:p>
+            <w:pPr>
+              <w:pStyle w:val="a9"/>
+              <w:jc w:val="right"/>
+            </w:pPr>
+          </w:p>
+        </w:tc>
+      </w:tr>
+      <w:bookmarkEnd w:id="0"/>
+      <w:tr>
+        <w:tblPrEx>
+          <w:tblBorders>
+            <w:top w:val="single" w:sz="4" w:space="0" w:color="auto"/>
+            <w:left w:val="single" w:sz="4" w:space="0" w:color="auto"/>
+            <w:bottom w:val="single" w:sz="4" w:space="0" w:color="auto"/>
+            <w:right w:val="single" w:sz="4" w:space="0" w:color="auto"/>
+            <w:insideH w:val="single" w:sz="4" w:space="0" w:color="auto"/>
+            <w:insideV w:val="single" w:sz="4" w:space="0" w:color="auto"/>
+          </w:tblBorders>
+        </w:tblPrEx>
+        <w:trPr>
+          <w:gridBefore w:val="1"/>
+          <w:gridAfter w:val="1"/>
+          <w:wBefore w:w="10" w:type="dxa"/>
+          <w:wAfter w:w="417" w:type="dxa"/>
+          <w:trHeight w:val="252"/>
+        </w:trPr>
+        <w:tc>
+          <w:tcPr>
+            <w:tcW w:w="2972" w:type="dxa"/>
+            <w:gridSpan w:val="2"/>
+            <w:tcBorders>
+              <w:top w:val="single" w:sz="4" w:space="0" w:color="000000"/>
+              <w:left w:val="single" w:sz="4" w:space="0" w:color="000000"/>
+              <w:bottom w:val="single" w:sz="4" w:space="0" w:color="000000"/>
+              <w:right w:val="single" w:sz="4" w:space="0" w:color="000000"/>
+            </w:tcBorders>
+            <w:vAlign w:val="center"/>
+            <w:hideMark/>
+          </w:tcPr>
+          <w:p>
+            <w:pPr>
+              <w:pStyle w:val="a9"/>
+              <w:jc w:val="center"/>
+              <w:rPr>
+                <w:b/>
+                <w:sz w:val="20"/>
+                <w:szCs w:val="20"/>
+              </w:rPr>
+            </w:pPr>
+            <w:r>
+              <w:rPr>
+                <w:b/>
+                <w:sz w:val="20"/>
+                <w:szCs w:val="20"/>
+              </w:rPr>
+              <w:t>Заявка №</w:t>
+            </w:r>
+          </w:p>
+        </w:tc>
+        <w:tc>
+          <w:tcPr>
+            <w:tcW w:w="1985" w:type="dxa"/>
+            <w:tcBorders>
+              <w:top w:val="single" w:sz="4" w:space="0" w:color="000000"/>
+              <w:left w:val="single" w:sz="4" w:space="0" w:color="000000"/>
+              <w:bottom w:val="single" w:sz="4" w:space="0" w:color="000000"/>
+              <w:right w:val="single" w:sz="4" w:space="0" w:color="000000"/>
+            </w:tcBorders>
+            <w:vAlign w:val="center"/>
+          </w:tcPr>
+          <w:p>
+            <w:pPr>
+              <w:pStyle w:val="a9"/>
+              <w:jc w:val="center"/>
+              <w:rPr>
+                <w:b/>
+                <w:sz w:val="20"/>
+                <w:szCs w:val="20"/>
+              </w:rPr>
+            </w:pPr>
+            <w:r>
+              <w:rPr>
+                <w:b/>
+                <w:sz w:val="18"/>
+                <w:szCs w:val="18"/>
+              </w:rPr>
+              <w:t>${</w:t>
+            </w:r>
+            <w:proofErr w:type="spellStart"/>
+            <w:r>
+              <w:rPr>
+                <w:b/>
+                <w:sz w:val="18"/>
+                <w:szCs w:val="18"/>
+                <w:lang w:val="en-US"/>
+              </w:rPr>
+              <w:t>nomer</w:t>
+            </w:r>
+            <w:proofErr w:type="spellEnd"/>
+            <w:r>
+              <w:rPr>
+                <w:b/>
+                <w:sz w:val="18"/>
+                <w:szCs w:val="18"/>
+              </w:rPr>
+              <w:t>_</w:t>
+            </w:r>
+            <w:proofErr w:type="spellStart"/>
+            <w:r>
+              <w:rPr>
+                <w:b/>
+                <w:sz w:val="18"/>
+                <w:szCs w:val="18"/>
+                <w:lang w:val="en-US"/>
+              </w:rPr>
+              <w:t>zayavki</w:t>
+            </w:r>
+            <w:proofErr w:type="spellEnd"/>
+            <w:r>
+              <w:rPr>
+                <w:b/>
+                <w:sz w:val="18"/>
+                <w:szCs w:val="18"/>
+              </w:rPr>
+              <w:t>}</w:t>
+            </w:r>
+          </w:p>
+        </w:tc>
+        <w:tc>
+          <w:tcPr>
+            <w:tcW w:w="3016" w:type="dxa"/>
+            <w:gridSpan w:val="3"/>
+            <w:tcBorders>
+              <w:top w:val="single" w:sz="4" w:space="0" w:color="000000"/>
+              <w:left w:val="single" w:sz="4" w:space="0" w:color="000000"/>
+              <w:bottom w:val="single" w:sz="4" w:space="0" w:color="000000"/>
+              <w:right w:val="single" w:sz="4" w:space="0" w:color="000000"/>
+            </w:tcBorders>
+            <w:vAlign w:val="center"/>
+          </w:tcPr>
+          <w:p>
+            <w:pPr>
+              <w:pStyle w:val="a9"/>
+              <w:jc w:val="center"/>
+              <w:rPr>
+                <w:b/>
+                <w:sz w:val="20"/>
+                <w:szCs w:val="20"/>
+              </w:rPr>
+            </w:pPr>
+            <w:r>
+              <w:rPr>
+                <w:b/>
+                <w:sz w:val="20"/>
+                <w:szCs w:val="20"/>
+              </w:rPr>
+              <w:t>от</w:t>
+            </w:r>
+          </w:p>
+        </w:tc>
+        <w:tc>
+          <w:tcPr>
+            <w:tcW w:w="2658" w:type="dxa"/>
+            <w:gridSpan w:val="2"/>
+            <w:tcBorders>
+              <w:top w:val="single" w:sz="4" w:space="0" w:color="000000"/>
+              <w:left w:val="single" w:sz="4" w:space="0" w:color="000000"/>
+              <w:bottom w:val="single" w:sz="4" w:space="0" w:color="000000"/>
+              <w:right w:val="single" w:sz="4" w:space="0" w:color="000000"/>
+            </w:tcBorders>
+            <w:vAlign w:val="center"/>
+          </w:tcPr>
+          <w:p>
+            <w:pPr>
+              <w:pStyle w:val="a9"/>
+              <w:jc w:val="center"/>
+              <w:rPr>
+                <w:b/>
+                <w:sz w:val="20"/>
+                <w:szCs w:val="20"/>
+              </w:rPr>
+            </w:pPr>
+            <w:r>
+              <w:rPr>
+                <w:b/>
+                <w:sz w:val="18"/>
+                <w:szCs w:val="18"/>
+              </w:rPr>
+              <w:t>${</w:t>
+            </w:r>
+            <w:r>
+              <w:rPr>
+                <w:b/>
+                <w:sz w:val="18"/>
+                <w:szCs w:val="18"/>
+                <w:lang w:val="en-US"/>
+              </w:rPr>
+              <w:t>data</w:t>
+            </w:r>
+            <w:r>
+              <w:rPr>
+                <w:b/>
+                <w:sz w:val="18"/>
+                <w:szCs w:val="18"/>
+              </w:rPr>
+              <w:t>_</w:t>
+            </w:r>
+            <w:proofErr w:type="spellStart"/>
+            <w:r>
+              <w:rPr>
+                <w:b/>
+                <w:sz w:val="18"/>
+                <w:szCs w:val="18"/>
+                <w:lang w:val="en-US"/>
+              </w:rPr>
+              <w:t>zakaza</w:t>
+            </w:r>
+            <w:proofErr w:type="spellEnd"/>
+            <w:r>
+              <w:rPr>
+                <w:b/>
+                <w:sz w:val="18"/>
+                <w:szCs w:val="18"/>
+              </w:rPr>
+              <w:t>}</w:t>
+            </w:r>
+          </w:p>
+        </w:tc>
+      </w:tr>
+      <w:tr>
+        <w:tblPrEx>
+          <w:tblBorders>
+            <w:top w:val="single" w:sz="4" w:space="0" w:color="auto"/>
+            <w:left w:val="single" w:sz="4" w:space="0" w:color="auto"/>
+            <w:bottom w:val="single" w:sz="4" w:space="0" w:color="auto"/>
+            <w:right w:val="single" w:sz="4" w:space="0" w:color="auto"/>
+            <w:insideH w:val="single" w:sz="4" w:space="0" w:color="auto"/>
+            <w:insideV w:val="single" w:sz="4" w:space="0" w:color="auto"/>
+          </w:tblBorders>
+        </w:tblPrEx>
+        <w:trPr>
+          <w:gridBefore w:val="1"/>
+          <w:gridAfter w:val="1"/>
+          <w:wBefore w:w="10" w:type="dxa"/>
+          <w:wAfter w:w="417" w:type="dxa"/>
+          <w:trHeight w:val="252"/>
+        </w:trPr>
+        <w:tc>
+          <w:tcPr>
+            <w:tcW w:w="4957" w:type="dxa"/>
+            <w:gridSpan w:val="3"/>
+            <w:tcBorders>
+              <w:top w:val="single" w:sz="4" w:space="0" w:color="000000"/>
+              <w:left w:val="single" w:sz="4" w:space="0" w:color="000000"/>
+              <w:bottom w:val="single" w:sz="4" w:space="0" w:color="000000"/>
+              <w:right w:val="single" w:sz="4" w:space="0" w:color="000000"/>
+            </w:tcBorders>
+            <w:vAlign w:val="center"/>
+          </w:tcPr>
+          <w:p>
+            <w:pPr>
+              <w:pStyle w:val="a9"/>
+              <w:jc w:val="center"/>
+              <w:rPr>
+                <w:b/>
+                <w:sz w:val="20"/>
+                <w:szCs w:val="20"/>
+              </w:rPr>
+            </w:pPr>
+            <w:r>
+              <w:rPr>
+                <w:b/>
+                <w:sz w:val="20"/>
+                <w:szCs w:val="20"/>
+              </w:rPr>
+              <w:t>Заказчик</w:t>
+            </w:r>
+          </w:p>
+        </w:tc>
+        <w:tc>
+          <w:tcPr>
+            <w:tcW w:w="5674" w:type="dxa"/>
+            <w:gridSpan w:val="5"/>
+            <w:tcBorders>
+              <w:top w:val="single" w:sz="4" w:space="0" w:color="000000"/>
+              <w:left w:val="single" w:sz="4" w:space="0" w:color="000000"/>
+              <w:bottom w:val="single" w:sz="4" w:space="0" w:color="000000"/>
+              <w:right w:val="single" w:sz="4" w:space="0" w:color="000000"/>
+            </w:tcBorders>
+            <w:vAlign w:val="center"/>
+          </w:tcPr>
+          <w:p>
+            <w:pPr>
+              <w:pStyle w:val="a9"/>
+              <w:jc w:val="center"/>
+              <w:rPr>
+                <w:b/>
+                <w:sz w:val="20"/>
+                <w:szCs w:val="20"/>
+              </w:rPr>
+            </w:pPr>
+            <w:r>
+              <w:rPr>
+                <w:b/>
+                <w:sz w:val="20"/>
+                <w:szCs w:val="20"/>
+              </w:rPr>
+              <w:t>Экспедитор</w:t>
+            </w:r>
+          </w:p>
+        </w:tc>
+      </w:tr>
+      <w:tr>
+        <w:tblPrEx>
+          <w:tblBorders>
+            <w:top w:val="single" w:sz="4" w:space="0" w:color="auto"/>
+            <w:left w:val="single" w:sz="4" w:space="0" w:color="auto"/>
+            <w:bottom w:val="single" w:sz="4" w:space="0" w:color="auto"/>
+            <w:right w:val="single" w:sz="4" w:space="0" w:color="auto"/>
+            <w:insideH w:val="single" w:sz="4" w:space="0" w:color="auto"/>
+            <w:insideV w:val="single" w:sz="4" w:space="0" w:color="auto"/>
+          </w:tblBorders>
+        </w:tblPrEx>
+        <w:trPr>
+          <w:gridBefore w:val="1"/>
+          <w:gridAfter w:val="1"/>
+          <w:wBefore w:w="10" w:type="dxa"/>
+          <w:wAfter w:w="417" w:type="dxa"/>
+          <w:trHeight w:val="252"/>
+        </w:trPr>
+        <w:tc>
+          <w:tcPr>
+            <w:tcW w:w="4957" w:type="dxa"/>
+            <w:gridSpan w:val="3"/>
+            <w:tcBorders>
+              <w:top w:val="single" w:sz="4" w:space="0" w:color="000000"/>
+              <w:left w:val="single" w:sz="4" w:space="0" w:color="000000"/>
+              <w:bottom w:val="single" w:sz="4" w:space="0" w:color="000000"/>
+              <w:right w:val="single" w:sz="4" w:space="0" w:color="000000"/>
+            </w:tcBorders>
+            <w:vAlign w:val="center"/>
+            <w:hideMark/>
+          </w:tcPr>
+          <w:p>
+            <w:pPr>
+              <w:pStyle w:val="a9"/>
+              <w:jc w:val="center"/>
+              <w:rPr>
+                <w:sz w:val="20"/>
+                <w:szCs w:val="20"/>
+              </w:rPr>
+            </w:pPr>
+            <w:r>
+              <w:rPr>
+                <w:b/>
+                <w:bCs/>
+                <w:sz w:val="20"/>
+                <w:szCs w:val="20"/>
+              </w:rPr>
+              <w:t>${</w:t>
+            </w:r>
+            <w:proofErr w:type="spellStart"/>
+            <w:r>
+              <w:rPr>
+                <w:b/>
+                <w:bCs/>
+                <w:sz w:val="20"/>
+                <w:szCs w:val="20"/>
+                <w:lang w:val="en-US"/>
+              </w:rPr>
+              <w:t>cp_nazv</w:t>
+            </w:r>
+            <w:proofErr w:type="spellEnd"/>
+            <w:r>
+              <w:rPr>
+                <w:b/>
+                <w:bCs/>
+                <w:sz w:val="20"/>
+                <w:szCs w:val="20"/>
+              </w:rPr>
+              <w:t>}</w:t>
+            </w:r>
+          </w:p>
+        </w:tc>
+        <w:tc>
+          <w:tcPr>
+            <w:tcW w:w="5674" w:type="dxa"/>
+            <w:gridSpan w:val="5"/>
+            <w:tcBorders>
+              <w:top w:val="single" w:sz="4" w:space="0" w:color="000000"/>
+              <w:left w:val="single" w:sz="4" w:space="0" w:color="000000"/>
+              <w:bottom w:val="single" w:sz="4" w:space="0" w:color="000000"/>
+              <w:right w:val="single" w:sz="4" w:space="0" w:color="000000"/>
+            </w:tcBorders>
+            <w:vAlign w:val="center"/>
+            <w:hideMark/>
+          </w:tcPr>
+          <w:p>
+            <w:pPr>
+              <w:pStyle w:val="a9"/>
+              <w:jc w:val="center"/>
+              <w:rPr>
+                <w:b/>
+                <w:bCs/>
+                <w:sz w:val="20"/>
+                <w:szCs w:val="20"/>
+              </w:rPr>
+            </w:pPr>
+            <w:r>
+              <w:rPr>
+                <w:b/>
+                <w:bCs/>
+                <w:sz w:val="20"/>
+                <w:szCs w:val="20"/>
+              </w:rPr>
+              <w:t>${</w:t>
+            </w:r>
+            <w:proofErr w:type="spellStart"/>
+            <w:r>
+              <w:rPr>
+                <w:b/>
+                <w:bCs/>
+                <w:sz w:val="20"/>
+                <w:szCs w:val="20"/>
+                <w:lang w:val="en-US"/>
+              </w:rPr>
+              <w:t>lp_nazv</w:t>
+            </w:r>
+            <w:proofErr w:type="spellEnd"/>
+            <w:r>
+              <w:rPr>
+                <w:b/>
+                <w:bCs/>
+                <w:sz w:val="20"/>
+                <w:szCs w:val="20"/>
+              </w:rPr>
+              <w:t>}</w:t>
+            </w:r>
+          </w:p>
+        </w:tc>
+      </w:tr>
+      <w:tr>
+        <w:tblPrEx>
+          <w:tblBorders>
+            <w:top w:val="single" w:sz="4" w:space="0" w:color="auto"/>
+            <w:left w:val="single" w:sz="4" w:space="0" w:color="auto"/>
+            <w:bottom w:val="single" w:sz="4" w:space="0" w:color="auto"/>
+            <w:right w:val="single" w:sz="4" w:space="0" w:color="auto"/>
+            <w:insideH w:val="single" w:sz="4" w:space="0" w:color="auto"/>
+            <w:insideV w:val="single" w:sz="4" w:space="0" w:color="auto"/>
+          </w:tblBorders>
+        </w:tblPrEx>
+        <w:trPr>
+          <w:gridBefore w:val="1"/>
+          <w:gridAfter w:val="1"/>
+          <w:wBefore w:w="10" w:type="dxa"/>
+          <w:wAfter w:w="417" w:type="dxa"/>
+          <w:trHeight w:val="252"/>
+        </w:trPr>
+        <w:tc>
+          <w:tcPr>
+            <w:tcW w:w="2433" w:type="dxa"/>
+            <w:tcBorders>
+              <w:top w:val="single" w:sz="4" w:space="0" w:color="000000"/>
+              <w:left w:val="single" w:sz="4" w:space="0" w:color="000000"/>
+              <w:bottom w:val="single" w:sz="4" w:space="0" w:color="000000"/>
+              <w:right w:val="single" w:sz="4" w:space="0" w:color="000000"/>
+            </w:tcBorders>
+            <w:vAlign w:val="center"/>
+            <w:hideMark/>
+          </w:tcPr>
+          <w:p>
+            <w:pPr>
+              <w:pStyle w:val="a9"/>
+              <w:jc w:val="center"/>
+              <w:rPr>
+                <w:b/>
+                <w:bCs/>
+                <w:sz w:val="20"/>
+                <w:szCs w:val="20"/>
+              </w:rPr>
+            </w:pPr>
+            <w:r>
+              <w:rPr>
+                <w:b/>
+                <w:bCs/>
+                <w:sz w:val="20"/>
+                <w:szCs w:val="20"/>
+                <w:lang w:val="en-US"/>
+              </w:rPr>
+              <w:t>${</w:t>
+            </w:r>
+            <w:proofErr w:type="spellStart"/>
+            <w:r>
+              <w:rPr>
+                <w:b/>
+                <w:bCs/>
+                <w:sz w:val="20"/>
+                <w:szCs w:val="20"/>
+                <w:lang w:val="en-US"/>
+              </w:rPr>
+              <w:t>cp_</w:t>
+            </w:r>
+            <w:r>
+              <w:rPr>
+                <w:b/>
+                <w:bCs/>
+                <w:sz w:val="20"/>
+                <w:szCs w:val="20"/>
+                <w:lang w:val="en-US"/>
+              </w:rPr>
+              <w:t>manager</w:t>
+            </w:r>
+            <w:proofErr w:type="spellEnd"/>
+            <w:r>
+              <w:rPr>
+                <w:b/>
+                <w:bCs/>
+                <w:sz w:val="20"/>
+                <w:szCs w:val="20"/>
+                <w:lang w:val="en-US"/>
+              </w:rPr>
+              <w:t>}</w:t>
+            </w:r>
+          </w:p>
+        </w:tc>
+        <w:tc>
+          <w:tcPr>
+            <w:tcW w:w="2524" w:type="dxa"/>
+            <w:gridSpan w:val="2"/>
+            <w:tcBorders>
+              <w:top w:val="single" w:sz="4" w:space="0" w:color="000000"/>
+              <w:left w:val="single" w:sz="4" w:space="0" w:color="000000"/>
+              <w:bottom w:val="single" w:sz="4" w:space="0" w:color="000000"/>
+              <w:right w:val="single" w:sz="4" w:space="0" w:color="000000"/>
+            </w:tcBorders>
+            <w:vAlign w:val="center"/>
+            <w:hideMark/>
+          </w:tcPr>
+          <w:p>
+            <w:pPr>
+              <w:pStyle w:val="a9"/>
+              <w:jc w:val="center"/>
+              <w:rPr>
+                <w:b/>
+                <w:bCs/>
+                <w:sz w:val="20"/>
+                <w:szCs w:val="20"/>
+              </w:rPr>
+            </w:pPr>
+            <w:r>
+              <w:rPr>
+                <w:b/>
+                <w:bCs/>
+                <w:sz w:val="20"/>
+                <w:szCs w:val="20"/>
+                <w:lang w:val="en-US"/>
+              </w:rPr>
+              <w:t>${</w:t>
+            </w:r>
+            <w:proofErr w:type="spellStart"/>
+            <w:r>
+              <w:rPr>
+                <w:b/>
+                <w:bCs/>
+                <w:sz w:val="20"/>
+                <w:szCs w:val="20"/>
+                <w:lang w:val="en-US"/>
+              </w:rPr>
+              <w:t>cp_</w:t>
+            </w:r>
+            <w:r>
+              <w:rPr>
+                <w:b/>
+                <w:bCs/>
+                <w:sz w:val="20"/>
+                <w:szCs w:val="20"/>
+                <w:lang w:val="en-US"/>
+              </w:rPr>
+              <w:t>manager_tel</w:t>
+            </w:r>
+            <w:proofErr w:type="spellEnd"/>
+            <w:r>
+              <w:rPr>
+                <w:b/>
+                <w:bCs/>
+                <w:sz w:val="20"/>
+                <w:szCs w:val="20"/>
+                <w:lang w:val="en-US"/>
+              </w:rPr>
+              <w:t>}</w:t>
+            </w:r>
+          </w:p>
+        </w:tc>
+        <w:tc>
+          <w:tcPr>
+            <w:tcW w:w="2835" w:type="dxa"/>
+            <w:tcBorders>
+              <w:top w:val="single" w:sz="4" w:space="0" w:color="000000"/>
+              <w:left w:val="single" w:sz="4" w:space="0" w:color="000000"/>
+              <w:bottom w:val="single" w:sz="4" w:space="0" w:color="000000"/>
+              <w:right w:val="single" w:sz="4" w:space="0" w:color="000000"/>
+            </w:tcBorders>
+            <w:vAlign w:val="center"/>
+            <w:hideMark/>
+          </w:tcPr>
+          <w:p>
+            <w:pPr>
+              <w:pStyle w:val="a9"/>
+              <w:jc w:val="center"/>
+              <w:rPr>
+                <w:sz w:val="20"/>
+                <w:szCs w:val="20"/>
+              </w:rPr>
+            </w:pPr>
+            <w:r>
+              <w:rPr>
+                <w:b/>
+                <w:bCs/>
+                <w:sz w:val="20"/>
+                <w:szCs w:val="20"/>
+                <w:lang w:val="en-US"/>
+              </w:rPr>
+              <w:t>${</w:t>
+            </w:r>
+            <w:proofErr w:type="spellStart"/>
+            <w:r>
+              <w:rPr>
+                <w:b/>
+                <w:bCs/>
+                <w:sz w:val="20"/>
+                <w:szCs w:val="20"/>
+                <w:lang w:val="en-US"/>
+              </w:rPr>
+              <w:t>lp_</w:t>
+            </w:r>
+            <w:r>
+              <w:rPr>
+                <w:b/>
+                <w:bCs/>
+                <w:sz w:val="20"/>
+                <w:szCs w:val="20"/>
+                <w:lang w:val="en-US"/>
+              </w:rPr>
+              <w:t>manager</w:t>
+            </w:r>
+            <w:proofErr w:type="spellEnd"/>
+            <w:r>
+              <w:rPr>
+                <w:b/>
+                <w:bCs/>
+                <w:sz w:val="20"/>
+                <w:szCs w:val="20"/>
+                <w:lang w:val="en-US"/>
+              </w:rPr>
+              <w:t>}</w:t>
+            </w:r>
+          </w:p>
+        </w:tc>
+        <w:tc>
+          <w:tcPr>
+            <w:tcW w:w="2839" w:type="dxa"/>
+            <w:gridSpan w:val="4"/>
+            <w:tcBorders>
+              <w:top w:val="single" w:sz="4" w:space="0" w:color="000000"/>
+              <w:left w:val="single" w:sz="4" w:space="0" w:color="000000"/>
+              <w:bottom w:val="single" w:sz="4" w:space="0" w:color="000000"/>
+              <w:right w:val="single" w:sz="4" w:space="0" w:color="000000"/>
+            </w:tcBorders>
+            <w:vAlign w:val="center"/>
+            <w:hideMark/>
+          </w:tcPr>
+          <w:p>
+            <w:pPr>
+              <w:pStyle w:val="a9"/>
+              <w:jc w:val="center"/>
+              <w:rPr>
+                <w:sz w:val="20"/>
+                <w:szCs w:val="20"/>
+              </w:rPr>
+            </w:pPr>
+            <w:r>
+              <w:rPr>
+                <w:b/>
+                <w:bCs/>
+                <w:sz w:val="20"/>
+                <w:szCs w:val="20"/>
+                <w:lang w:val="en-US"/>
+              </w:rPr>
+              <w:t>${</w:t>
+            </w:r>
+            <w:proofErr w:type="spellStart"/>
+            <w:r>
+              <w:rPr>
+                <w:b/>
+                <w:bCs/>
+                <w:sz w:val="20"/>
+                <w:szCs w:val="20"/>
+                <w:lang w:val="en-US"/>
+              </w:rPr>
+              <w:t>lp_</w:t>
+            </w:r>
+            <w:r>
+              <w:rPr>
+                <w:b/>
+                <w:bCs/>
+                <w:sz w:val="20"/>
+                <w:szCs w:val="20"/>
+                <w:lang w:val="en-US"/>
+              </w:rPr>
+              <w:t>manager_tel</w:t>
+            </w:r>
+            <w:proofErr w:type="spellEnd"/>
+            <w:r>
+              <w:rPr>
+                <w:b/>
+                <w:bCs/>
+                <w:sz w:val="20"/>
+                <w:szCs w:val="20"/>
+                <w:lang w:val="en-US"/>
+              </w:rPr>
+              <w:t>}</w:t>
+            </w:r>
+          </w:p>
+        </w:tc>
+      </w:tr>
+    </w:tbl>
     <w:p>
       <w:pPr>
         <w:pStyle w:val="a9"/>
-        <w:jc w:val="both"/>
         <w:rPr>
           <w:b/>
-          <w:bCs/>
-          <w:i/>
-          <w:iCs/>
           <w:sz w:val="20"/>
           <w:szCs w:val="20"/>
         </w:rPr>
       </w:pPr>
-      <w:r>
-        <w:rPr>
-          <w:b/>
-          <w:bCs/>
-          <w:i/>
-          <w:iCs/>
-          <w:sz w:val="20"/>
-          <w:szCs w:val="20"/>
-        </w:rPr>
-        <w:t>Настоящая Заявка является поручением Экспедитору в соответствии с Договором транспортной экспедиции (публичная оферта), размещенным по адресу: [ваш-</w:t>
-      </w:r>
-      <w:proofErr w:type="spellStart"/>
-      <w:proofErr w:type="gramStart"/>
-      <w:r>
-        <w:rPr>
-          <w:b/>
-          <w:bCs/>
-          <w:i/>
-          <w:iCs/>
-          <w:sz w:val="20"/>
-          <w:szCs w:val="20"/>
-        </w:rPr>
-        <w:t>сайт.рф</w:t>
-      </w:r>
-      <w:proofErr w:type="spellEnd"/>
-      <w:proofErr w:type="gramEnd"/>
-      <w:r>
-        <w:rPr>
-          <w:b/>
-          <w:bCs/>
-          <w:i/>
-          <w:iCs/>
-          <w:sz w:val="20"/>
-          <w:szCs w:val="20"/>
-        </w:rPr>
-        <w:t>/</w:t>
-      </w:r>
-      <w:proofErr w:type="spellStart"/>
-      <w:r>
-        <w:rPr>
-          <w:b/>
-          <w:bCs/>
-          <w:i/>
-          <w:iCs/>
-          <w:sz w:val="20"/>
-          <w:szCs w:val="20"/>
-        </w:rPr>
-        <w:t>oferta-klient</w:t>
-      </w:r>
-      <w:proofErr w:type="spellEnd"/>
-      <w:r>
-        <w:rPr>
-          <w:b/>
-          <w:bCs/>
-          <w:i/>
-          <w:iCs/>
-          <w:sz w:val="20"/>
-          <w:szCs w:val="20"/>
-        </w:rPr>
-        <w:t xml:space="preserve">]. Акцептом Заявки со стороны </w:t>
-      </w:r>
-      <w:r>
-        <w:rPr>
-          <w:b/>
-          <w:bCs/>
-          <w:i/>
-          <w:iCs/>
-          <w:sz w:val="20"/>
-          <w:szCs w:val="20"/>
-        </w:rPr>
-        <w:t>Заказчика</w:t>
-      </w:r>
-      <w:r>
-        <w:rPr>
-          <w:b/>
-          <w:bCs/>
-          <w:i/>
-          <w:iCs/>
-          <w:sz w:val="20"/>
-          <w:szCs w:val="20"/>
-        </w:rPr>
-        <w:t xml:space="preserve"> является направление подтверждения или </w:t>
-      </w:r>
-      <w:r>
-        <w:rPr>
-          <w:b/>
-          <w:bCs/>
-          <w:i/>
-          <w:iCs/>
-          <w:sz w:val="20"/>
-          <w:szCs w:val="20"/>
-        </w:rPr>
-        <w:t>оплата услуг Экспедитора</w:t>
-      </w:r>
-      <w:r>
-        <w:rPr>
-          <w:b/>
-          <w:bCs/>
-          <w:i/>
-          <w:iCs/>
-          <w:sz w:val="20"/>
-          <w:szCs w:val="20"/>
-        </w:rPr>
-        <w:t>.</w:t>
-      </w:r>
     </w:p>
-    <w:p>
-      <w:pPr>
-        <w:pStyle w:val="a9"/>
-      </w:pPr>
-    </w:p>
-    <w:tbl>
-      <w:tblPr>
-        <w:tblStyle w:val="a8"/>
-        <w:tblW w:w="10631" w:type="dxa"/>
-        <w:tblLayout w:type="fixed"/>
-        <w:tblLook w:val="04A0" w:firstRow="1" w:lastRow="0" w:firstColumn="1" w:lastColumn="0" w:noHBand="0" w:noVBand="1"/>
-      </w:tblPr>
-      <w:tblGrid>
-        <w:gridCol w:w="2433"/>
-        <w:gridCol w:w="539"/>
-        <w:gridCol w:w="1985"/>
-        <w:gridCol w:w="2835"/>
-        <w:gridCol w:w="181"/>
-        <w:gridCol w:w="2658"/>
-      </w:tblGrid>
-      <w:tr>
-        <w:trPr>
-          <w:trHeight w:val="252"/>
-        </w:trPr>
-        <w:tc>
-          <w:tcPr>
-            <w:tcW w:w="2972" w:type="dxa"/>
-            <w:gridSpan w:val="2"/>
-            <w:tcBorders>
-              <w:top w:val="single" w:sz="4" w:space="0" w:color="000000"/>
-              <w:left w:val="single" w:sz="4" w:space="0" w:color="000000"/>
-              <w:bottom w:val="single" w:sz="4" w:space="0" w:color="000000"/>
-              <w:right w:val="single" w:sz="4" w:space="0" w:color="000000"/>
-            </w:tcBorders>
-            <w:vAlign w:val="center"/>
-            <w:hideMark/>
-          </w:tcPr>
-          <w:p>
-            <w:pPr>
-              <w:pStyle w:val="a9"/>
-              <w:jc w:val="center"/>
-              <w:rPr>
-                <w:b/>
-                <w:sz w:val="20"/>
-                <w:szCs w:val="20"/>
-              </w:rPr>
-            </w:pPr>
-            <w:r>
-              <w:rPr>
-                <w:b/>
-                <w:sz w:val="20"/>
-                <w:szCs w:val="20"/>
-              </w:rPr>
-              <w:t>Заявка №</w:t>
-            </w:r>
-          </w:p>
-        </w:tc>
-        <w:tc>
-          <w:tcPr>
-            <w:tcW w:w="1985" w:type="dxa"/>
-            <w:tcBorders>
-              <w:top w:val="single" w:sz="4" w:space="0" w:color="000000"/>
-              <w:left w:val="single" w:sz="4" w:space="0" w:color="000000"/>
-              <w:bottom w:val="single" w:sz="4" w:space="0" w:color="000000"/>
-              <w:right w:val="single" w:sz="4" w:space="0" w:color="000000"/>
-            </w:tcBorders>
-            <w:vAlign w:val="center"/>
-          </w:tcPr>
-          <w:p>
-            <w:pPr>
-              <w:pStyle w:val="a9"/>
-              <w:jc w:val="center"/>
-              <w:rPr>
-                <w:b/>
-                <w:sz w:val="20"/>
-                <w:szCs w:val="20"/>
-              </w:rPr>
-            </w:pPr>
-            <w:r>
-              <w:rPr>
-                <w:b/>
-                <w:sz w:val="18"/>
-                <w:szCs w:val="18"/>
-              </w:rPr>
-              <w:t>${</w:t>
-            </w:r>
-            <w:proofErr w:type="spellStart"/>
-            <w:r>
-              <w:rPr>
-                <w:b/>
-                <w:sz w:val="18"/>
-                <w:szCs w:val="18"/>
-                <w:lang w:val="en-US"/>
-              </w:rPr>
-              <w:t>nomer</w:t>
-            </w:r>
-            <w:proofErr w:type="spellEnd"/>
-            <w:r>
-              <w:rPr>
-                <w:b/>
-                <w:sz w:val="18"/>
-                <w:szCs w:val="18"/>
-              </w:rPr>
-              <w:t>_</w:t>
-            </w:r>
-            <w:proofErr w:type="spellStart"/>
-            <w:r>
-              <w:rPr>
-                <w:b/>
-                <w:sz w:val="18"/>
-                <w:szCs w:val="18"/>
-                <w:lang w:val="en-US"/>
-              </w:rPr>
-              <w:t>zayavki</w:t>
-            </w:r>
-            <w:proofErr w:type="spellEnd"/>
-            <w:r>
-              <w:rPr>
-                <w:b/>
-                <w:sz w:val="18"/>
-                <w:szCs w:val="18"/>
-              </w:rPr>
-              <w:t>}</w:t>
-            </w:r>
-          </w:p>
-        </w:tc>
-        <w:tc>
-          <w:tcPr>
-            <w:tcW w:w="3016" w:type="dxa"/>
-            <w:gridSpan w:val="2"/>
-            <w:tcBorders>
-              <w:top w:val="single" w:sz="4" w:space="0" w:color="000000"/>
-              <w:left w:val="single" w:sz="4" w:space="0" w:color="000000"/>
-              <w:bottom w:val="single" w:sz="4" w:space="0" w:color="000000"/>
-              <w:right w:val="single" w:sz="4" w:space="0" w:color="000000"/>
-            </w:tcBorders>
-            <w:vAlign w:val="center"/>
-          </w:tcPr>
-          <w:p>
-            <w:pPr>
-              <w:pStyle w:val="a9"/>
-              <w:jc w:val="center"/>
-              <w:rPr>
-                <w:b/>
-                <w:sz w:val="20"/>
-                <w:szCs w:val="20"/>
-              </w:rPr>
-            </w:pPr>
-            <w:r>
-              <w:rPr>
-                <w:b/>
-                <w:sz w:val="20"/>
-                <w:szCs w:val="20"/>
-              </w:rPr>
-              <w:t>от</w:t>
-            </w:r>
-          </w:p>
-        </w:tc>
-        <w:tc>
-          <w:tcPr>
-            <w:tcW w:w="2658" w:type="dxa"/>
-            <w:tcBorders>
-              <w:top w:val="single" w:sz="4" w:space="0" w:color="000000"/>
-              <w:left w:val="single" w:sz="4" w:space="0" w:color="000000"/>
-              <w:bottom w:val="single" w:sz="4" w:space="0" w:color="000000"/>
-              <w:right w:val="single" w:sz="4" w:space="0" w:color="000000"/>
-            </w:tcBorders>
-            <w:vAlign w:val="center"/>
-          </w:tcPr>
-          <w:p>
-            <w:pPr>
-              <w:pStyle w:val="a9"/>
-              <w:jc w:val="center"/>
-              <w:rPr>
-                <w:b/>
-                <w:sz w:val="20"/>
-                <w:szCs w:val="20"/>
-              </w:rPr>
-            </w:pPr>
-            <w:r>
-              <w:rPr>
-                <w:b/>
-                <w:sz w:val="18"/>
-                <w:szCs w:val="18"/>
-              </w:rPr>
-              <w:t>${</w:t>
-            </w:r>
-            <w:r>
-              <w:rPr>
-                <w:b/>
-                <w:sz w:val="18"/>
-                <w:szCs w:val="18"/>
-                <w:lang w:val="en-US"/>
-              </w:rPr>
-              <w:t>data</w:t>
-            </w:r>
-            <w:r>
-              <w:rPr>
-                <w:b/>
-                <w:sz w:val="18"/>
-                <w:szCs w:val="18"/>
-              </w:rPr>
-              <w:t>_</w:t>
-            </w:r>
-            <w:proofErr w:type="spellStart"/>
-            <w:r>
-              <w:rPr>
-                <w:b/>
-                <w:sz w:val="18"/>
-                <w:szCs w:val="18"/>
-                <w:lang w:val="en-US"/>
-              </w:rPr>
-              <w:t>zakaza</w:t>
-            </w:r>
-            <w:proofErr w:type="spellEnd"/>
-            <w:r>
-              <w:rPr>
-                <w:b/>
-                <w:sz w:val="18"/>
-                <w:szCs w:val="18"/>
-              </w:rPr>
-              <w:t>}</w:t>
-            </w:r>
-          </w:p>
-        </w:tc>
-      </w:tr>
-      <w:tr>
-        <w:trPr>
-          <w:trHeight w:val="252"/>
-        </w:trPr>
-        <w:tc>
-          <w:tcPr>
-            <w:tcW w:w="4957" w:type="dxa"/>
-            <w:gridSpan w:val="3"/>
-            <w:tcBorders>
-              <w:top w:val="single" w:sz="4" w:space="0" w:color="000000"/>
-              <w:left w:val="single" w:sz="4" w:space="0" w:color="000000"/>
-              <w:bottom w:val="single" w:sz="4" w:space="0" w:color="000000"/>
-              <w:right w:val="single" w:sz="4" w:space="0" w:color="000000"/>
-            </w:tcBorders>
-            <w:vAlign w:val="center"/>
-          </w:tcPr>
-          <w:p>
-            <w:pPr>
-              <w:pStyle w:val="a9"/>
-              <w:jc w:val="center"/>
-              <w:rPr>
-                <w:b/>
-                <w:sz w:val="20"/>
-                <w:szCs w:val="20"/>
-              </w:rPr>
-            </w:pPr>
-            <w:r>
-              <w:rPr>
-                <w:b/>
-                <w:sz w:val="20"/>
-                <w:szCs w:val="20"/>
-              </w:rPr>
-              <w:t>Заказчик</w:t>
-            </w:r>
-          </w:p>
-        </w:tc>
-        <w:tc>
-          <w:tcPr>
-            <w:tcW w:w="5674" w:type="dxa"/>
-            <w:gridSpan w:val="3"/>
-            <w:tcBorders>
-              <w:top w:val="single" w:sz="4" w:space="0" w:color="000000"/>
-              <w:left w:val="single" w:sz="4" w:space="0" w:color="000000"/>
-              <w:bottom w:val="single" w:sz="4" w:space="0" w:color="000000"/>
-              <w:right w:val="single" w:sz="4" w:space="0" w:color="000000"/>
-            </w:tcBorders>
-            <w:vAlign w:val="center"/>
-          </w:tcPr>
-          <w:p>
-            <w:pPr>
-              <w:pStyle w:val="a9"/>
-              <w:jc w:val="center"/>
-              <w:rPr>
-                <w:b/>
-                <w:sz w:val="20"/>
-                <w:szCs w:val="20"/>
-              </w:rPr>
-            </w:pPr>
-            <w:r>
-              <w:rPr>
-                <w:b/>
-                <w:sz w:val="20"/>
-                <w:szCs w:val="20"/>
-              </w:rPr>
-              <w:t>Экспедитор</w:t>
-            </w:r>
-          </w:p>
-        </w:tc>
-      </w:tr>
-      <w:tr>
-        <w:trPr>
-          <w:trHeight w:val="252"/>
-        </w:trPr>
-        <w:tc>
-          <w:tcPr>
-            <w:tcW w:w="4957" w:type="dxa"/>
-            <w:gridSpan w:val="3"/>
-            <w:tcBorders>
-              <w:top w:val="single" w:sz="4" w:space="0" w:color="000000"/>
-              <w:left w:val="single" w:sz="4" w:space="0" w:color="000000"/>
-              <w:bottom w:val="single" w:sz="4" w:space="0" w:color="000000"/>
-              <w:right w:val="single" w:sz="4" w:space="0" w:color="000000"/>
-            </w:tcBorders>
-            <w:vAlign w:val="center"/>
-            <w:hideMark/>
-          </w:tcPr>
-          <w:p>
-            <w:pPr>
-              <w:pStyle w:val="a9"/>
-              <w:jc w:val="center"/>
-              <w:rPr>
-                <w:sz w:val="20"/>
-                <w:szCs w:val="20"/>
-              </w:rPr>
-            </w:pPr>
-            <w:r>
-              <w:rPr>
-                <w:b/>
-                <w:bCs/>
-                <w:sz w:val="20"/>
-                <w:szCs w:val="20"/>
-              </w:rPr>
-              <w:t>${</w:t>
-            </w:r>
-            <w:proofErr w:type="spellStart"/>
-            <w:r>
-              <w:rPr>
-                <w:b/>
-                <w:bCs/>
-                <w:sz w:val="20"/>
-                <w:szCs w:val="20"/>
-                <w:lang w:val="en-US"/>
-              </w:rPr>
-              <w:t>cp_nazv</w:t>
-            </w:r>
-            <w:proofErr w:type="spellEnd"/>
-            <w:r>
-              <w:rPr>
-                <w:b/>
-                <w:bCs/>
-                <w:sz w:val="20"/>
-                <w:szCs w:val="20"/>
-              </w:rPr>
-              <w:t>}</w:t>
-            </w:r>
-          </w:p>
-        </w:tc>
-        <w:tc>
-          <w:tcPr>
-            <w:tcW w:w="5674" w:type="dxa"/>
-            <w:gridSpan w:val="3"/>
-            <w:tcBorders>
-              <w:top w:val="single" w:sz="4" w:space="0" w:color="000000"/>
-              <w:left w:val="single" w:sz="4" w:space="0" w:color="000000"/>
-              <w:bottom w:val="single" w:sz="4" w:space="0" w:color="000000"/>
-              <w:right w:val="single" w:sz="4" w:space="0" w:color="000000"/>
-            </w:tcBorders>
-            <w:vAlign w:val="center"/>
-            <w:hideMark/>
-          </w:tcPr>
-          <w:p>
-            <w:pPr>
-              <w:pStyle w:val="a9"/>
-              <w:jc w:val="center"/>
-              <w:rPr>
-                <w:b/>
-                <w:bCs/>
-                <w:sz w:val="20"/>
-                <w:szCs w:val="20"/>
-              </w:rPr>
-            </w:pPr>
-            <w:r>
-              <w:rPr>
-                <w:b/>
-                <w:bCs/>
-                <w:sz w:val="20"/>
-                <w:szCs w:val="20"/>
-              </w:rPr>
-              <w:t>${</w:t>
-            </w:r>
-            <w:proofErr w:type="spellStart"/>
-            <w:r>
-              <w:rPr>
-                <w:b/>
-                <w:bCs/>
-                <w:sz w:val="20"/>
-                <w:szCs w:val="20"/>
-                <w:lang w:val="en-US"/>
-              </w:rPr>
-              <w:t>lp_nazv</w:t>
-            </w:r>
-            <w:proofErr w:type="spellEnd"/>
-            <w:r>
-              <w:rPr>
-                <w:b/>
-                <w:bCs/>
-                <w:sz w:val="20"/>
-                <w:szCs w:val="20"/>
-              </w:rPr>
-              <w:t>}</w:t>
-            </w:r>
-          </w:p>
-        </w:tc>
-      </w:tr>
-      <w:tr>
-        <w:trPr>
-          <w:trHeight w:val="252"/>
-        </w:trPr>
-        <w:tc>
-          <w:tcPr>
-            <w:tcW w:w="2433" w:type="dxa"/>
-            <w:tcBorders>
-              <w:top w:val="single" w:sz="4" w:space="0" w:color="000000"/>
-              <w:left w:val="single" w:sz="4" w:space="0" w:color="000000"/>
-              <w:bottom w:val="single" w:sz="4" w:space="0" w:color="000000"/>
-              <w:right w:val="single" w:sz="4" w:space="0" w:color="000000"/>
-            </w:tcBorders>
-            <w:vAlign w:val="center"/>
-            <w:hideMark/>
-          </w:tcPr>
-          <w:p>
-            <w:pPr>
-              <w:pStyle w:val="a9"/>
-              <w:jc w:val="center"/>
-              <w:rPr>
-                <w:b/>
-                <w:bCs/>
-                <w:sz w:val="20"/>
-                <w:szCs w:val="20"/>
-              </w:rPr>
-            </w:pPr>
-            <w:r>
-              <w:rPr>
-                <w:b/>
-                <w:bCs/>
-                <w:sz w:val="20"/>
-                <w:szCs w:val="20"/>
-                <w:lang w:val="en-US"/>
-              </w:rPr>
-              <w:t>${</w:t>
-            </w:r>
-            <w:proofErr w:type="spellStart"/>
-            <w:r>
-              <w:rPr>
-                <w:b/>
-                <w:bCs/>
-                <w:sz w:val="20"/>
-                <w:szCs w:val="20"/>
-                <w:lang w:val="en-US"/>
-              </w:rPr>
-              <w:t>cp_</w:t>
-            </w:r>
-            <w:r>
-              <w:rPr>
-                <w:b/>
-                <w:bCs/>
-                <w:sz w:val="20"/>
-                <w:szCs w:val="20"/>
-                <w:lang w:val="en-US"/>
-              </w:rPr>
-              <w:t>manager</w:t>
-            </w:r>
-            <w:proofErr w:type="spellEnd"/>
-            <w:r>
-              <w:rPr>
-                <w:b/>
-                <w:bCs/>
-                <w:sz w:val="20"/>
-                <w:szCs w:val="20"/>
-                <w:lang w:val="en-US"/>
-              </w:rPr>
-              <w:t>}</w:t>
-            </w:r>
-          </w:p>
-        </w:tc>
-        <w:tc>
-          <w:tcPr>
-            <w:tcW w:w="2524" w:type="dxa"/>
-            <w:gridSpan w:val="2"/>
-            <w:tcBorders>
-              <w:top w:val="single" w:sz="4" w:space="0" w:color="000000"/>
-              <w:left w:val="single" w:sz="4" w:space="0" w:color="000000"/>
-              <w:bottom w:val="single" w:sz="4" w:space="0" w:color="000000"/>
-              <w:right w:val="single" w:sz="4" w:space="0" w:color="000000"/>
-            </w:tcBorders>
-            <w:vAlign w:val="center"/>
-            <w:hideMark/>
-          </w:tcPr>
-          <w:p>
-            <w:pPr>
-              <w:pStyle w:val="a9"/>
-              <w:jc w:val="center"/>
-              <w:rPr>
-                <w:b/>
-                <w:bCs/>
-                <w:sz w:val="20"/>
-                <w:szCs w:val="20"/>
-              </w:rPr>
-            </w:pPr>
-            <w:r>
-              <w:rPr>
-                <w:b/>
-                <w:bCs/>
-                <w:sz w:val="20"/>
-                <w:szCs w:val="20"/>
-                <w:lang w:val="en-US"/>
-              </w:rPr>
-              <w:t>${</w:t>
-            </w:r>
-            <w:proofErr w:type="spellStart"/>
-            <w:r>
-              <w:rPr>
-                <w:b/>
-                <w:bCs/>
-                <w:sz w:val="20"/>
-                <w:szCs w:val="20"/>
-                <w:lang w:val="en-US"/>
-              </w:rPr>
-              <w:t>cp_</w:t>
-            </w:r>
-            <w:r>
-              <w:rPr>
-                <w:b/>
-                <w:bCs/>
-                <w:sz w:val="20"/>
-                <w:szCs w:val="20"/>
-                <w:lang w:val="en-US"/>
-              </w:rPr>
-              <w:t>manager_tel</w:t>
-            </w:r>
-            <w:proofErr w:type="spellEnd"/>
-            <w:r>
-              <w:rPr>
-                <w:b/>
-                <w:bCs/>
-                <w:sz w:val="20"/>
-                <w:szCs w:val="20"/>
-                <w:lang w:val="en-US"/>
-              </w:rPr>
-              <w:t>}</w:t>
-            </w:r>
-          </w:p>
-        </w:tc>
-        <w:tc>
-          <w:tcPr>
-            <w:tcW w:w="2835" w:type="dxa"/>
-            <w:tcBorders>
-              <w:top w:val="single" w:sz="4" w:space="0" w:color="000000"/>
-              <w:left w:val="single" w:sz="4" w:space="0" w:color="000000"/>
-              <w:bottom w:val="single" w:sz="4" w:space="0" w:color="000000"/>
-              <w:right w:val="single" w:sz="4" w:space="0" w:color="000000"/>
-            </w:tcBorders>
-            <w:vAlign w:val="center"/>
-            <w:hideMark/>
-          </w:tcPr>
-          <w:p>
-            <w:pPr>
-              <w:pStyle w:val="a9"/>
-              <w:jc w:val="center"/>
-              <w:rPr>
-                <w:sz w:val="20"/>
-                <w:szCs w:val="20"/>
-              </w:rPr>
-            </w:pPr>
-            <w:r>
-              <w:rPr>
-                <w:b/>
-                <w:bCs/>
-                <w:sz w:val="20"/>
-                <w:szCs w:val="20"/>
-                <w:lang w:val="en-US"/>
-              </w:rPr>
-              <w:t>${</w:t>
-            </w:r>
-            <w:proofErr w:type="spellStart"/>
-            <w:r>
-              <w:rPr>
-                <w:b/>
-                <w:bCs/>
-                <w:sz w:val="20"/>
-                <w:szCs w:val="20"/>
-                <w:lang w:val="en-US"/>
-              </w:rPr>
-              <w:t>lp_</w:t>
-            </w:r>
-            <w:r>
-              <w:rPr>
-                <w:b/>
-                <w:bCs/>
-                <w:sz w:val="20"/>
-                <w:szCs w:val="20"/>
-                <w:lang w:val="en-US"/>
-              </w:rPr>
-              <w:t>manager</w:t>
-            </w:r>
-            <w:proofErr w:type="spellEnd"/>
-            <w:r>
-              <w:rPr>
-                <w:b/>
-                <w:bCs/>
-                <w:sz w:val="20"/>
-                <w:szCs w:val="20"/>
-                <w:lang w:val="en-US"/>
-              </w:rPr>
-              <w:t>}</w:t>
-            </w:r>
-          </w:p>
-        </w:tc>
-        <w:tc>
-          <w:tcPr>
-            <w:tcW w:w="2839" w:type="dxa"/>
-            <w:gridSpan w:val="2"/>
-            <w:tcBorders>
-              <w:top w:val="single" w:sz="4" w:space="0" w:color="000000"/>
-              <w:left w:val="single" w:sz="4" w:space="0" w:color="000000"/>
-              <w:bottom w:val="single" w:sz="4" w:space="0" w:color="000000"/>
-              <w:right w:val="single" w:sz="4" w:space="0" w:color="000000"/>
-            </w:tcBorders>
-            <w:vAlign w:val="center"/>
-            <w:hideMark/>
-          </w:tcPr>
-          <w:p>
-            <w:pPr>
-              <w:pStyle w:val="a9"/>
-              <w:jc w:val="center"/>
-              <w:rPr>
-                <w:sz w:val="20"/>
-                <w:szCs w:val="20"/>
-              </w:rPr>
-            </w:pPr>
-            <w:r>
-              <w:rPr>
-                <w:b/>
-                <w:bCs/>
-                <w:sz w:val="20"/>
-                <w:szCs w:val="20"/>
-                <w:lang w:val="en-US"/>
-              </w:rPr>
-              <w:t>${</w:t>
-            </w:r>
-            <w:proofErr w:type="spellStart"/>
-            <w:r>
-              <w:rPr>
-                <w:b/>
-                <w:bCs/>
-                <w:sz w:val="20"/>
-                <w:szCs w:val="20"/>
-                <w:lang w:val="en-US"/>
-              </w:rPr>
-              <w:t>lp_</w:t>
-            </w:r>
-            <w:r>
-              <w:rPr>
-                <w:b/>
-                <w:bCs/>
-                <w:sz w:val="20"/>
-                <w:szCs w:val="20"/>
-                <w:lang w:val="en-US"/>
-              </w:rPr>
-              <w:t>manager_tel</w:t>
-            </w:r>
-            <w:proofErr w:type="spellEnd"/>
-            <w:r>
-              <w:rPr>
-                <w:b/>
-                <w:bCs/>
-                <w:sz w:val="20"/>
-                <w:szCs w:val="20"/>
-                <w:lang w:val="en-US"/>
-              </w:rPr>
-              <w:t>}</w:t>
-            </w:r>
-          </w:p>
-        </w:tc>
-      </w:tr>
-    </w:tbl>
     <w:p>
       <w:pPr>
         <w:pStyle w:val="a9"/>
@@ -831,11 +1189,13 @@
       <w:tblGrid>
         <w:gridCol w:w="411"/>
         <w:gridCol w:w="3128"/>
-        <w:gridCol w:w="2126"/>
-        <w:gridCol w:w="1110"/>
+        <w:gridCol w:w="992"/>
+        <w:gridCol w:w="562"/>
+        <w:gridCol w:w="572"/>
+        <w:gridCol w:w="1251"/>
+        <w:gridCol w:w="1159"/>
         <w:gridCol w:w="1284"/>
-        <w:gridCol w:w="1284"/>
-        <w:gridCol w:w="1284"/>
+        <w:gridCol w:w="1268"/>
       </w:tblGrid>
       <w:tr>
         <w:tc>
@@ -899,7 +1259,7 @@
         </w:tc>
         <w:tc>
           <w:tcPr>
-            <w:tcW w:w="2126" w:type="dxa"/>
+            <w:tcW w:w="992" w:type="dxa"/>
             <w:tcBorders>
               <w:top w:val="single" w:sz="4" w:space="0" w:color="000000"/>
               <w:left w:val="single" w:sz="4" w:space="0" w:color="000000"/>
@@ -923,7 +1283,7 @@
                 <w:sz w:val="16"/>
                 <w:szCs w:val="16"/>
               </w:rPr>
-              <w:t>Количество</w:t>
+              <w:t>Кол.-во</w:t>
             </w:r>
             <w:r>
               <w:rPr>
@@ -936,7 +1296,7 @@
         </w:tc>
         <w:tc>
           <w:tcPr>
-            <w:tcW w:w="2394" w:type="dxa"/>
+            <w:tcW w:w="1134" w:type="dxa"/>
             <w:gridSpan w:val="2"/>
             <w:tcBorders>
               <w:top w:val="single" w:sz="4" w:space="0" w:color="auto"/>
@@ -944,6 +1304,35 @@
               <w:bottom w:val="single" w:sz="4" w:space="0" w:color="auto"/>
               <w:right w:val="single" w:sz="4" w:space="0" w:color="auto"/>
             </w:tcBorders>
+          </w:tcPr>
+          <w:p>
+            <w:pPr>
+              <w:pStyle w:val="a9"/>
+              <w:jc w:val="center"/>
+              <w:rPr>
+                <w:sz w:val="16"/>
+                <w:szCs w:val="16"/>
+              </w:rPr>
+            </w:pPr>
+            <w:r>
+              <w:rPr>
+                <w:sz w:val="16"/>
+                <w:szCs w:val="16"/>
+              </w:rPr>
+              <w:t>Тип места</w:t>
+            </w:r>
+          </w:p>
+        </w:tc>
+        <w:tc>
+          <w:tcPr>
+            <w:tcW w:w="2410" w:type="dxa"/>
+            <w:gridSpan w:val="2"/>
+            <w:tcBorders>
+              <w:top w:val="single" w:sz="4" w:space="0" w:color="auto"/>
+              <w:left w:val="single" w:sz="4" w:space="0" w:color="auto"/>
+              <w:bottom w:val="single" w:sz="4" w:space="0" w:color="auto"/>
+              <w:right w:val="single" w:sz="4" w:space="0" w:color="auto"/>
+            </w:tcBorders>
             <w:vAlign w:val="center"/>
             <w:hideMark/>
           </w:tcPr>
@@ -967,7 +1356,7 @@
         </w:tc>
         <w:tc>
           <w:tcPr>
-            <w:tcW w:w="2568" w:type="dxa"/>
+            <w:tcW w:w="2552" w:type="dxa"/>
             <w:gridSpan w:val="2"/>
             <w:tcBorders>
               <w:top w:val="single" w:sz="4" w:space="0" w:color="000000"/>
@@ -991,7 +1380,21 @@
                 <w:sz w:val="16"/>
                 <w:szCs w:val="16"/>
               </w:rPr>
-              <w:t>Габариты, м</w:t>
+              <w:t>Габариты</w:t>
+            </w:r>
+            <w:r>
+              <w:rPr>
+                <w:sz w:val="16"/>
+                <w:szCs w:val="16"/>
+              </w:rPr>
+              <w:t xml:space="preserve"> места</w:t>
+            </w:r>
+            <w:r>
+              <w:rPr>
+                <w:sz w:val="16"/>
+                <w:szCs w:val="16"/>
+              </w:rPr>
+              <w:t>, м</w:t>
             </w:r>
           </w:p>
         </w:tc>
@@ -1070,7 +1473,7 @@
         </w:tc>
         <w:tc>
           <w:tcPr>
-            <w:tcW w:w="2126" w:type="dxa"/>
+            <w:tcW w:w="992" w:type="dxa"/>
             <w:tcBorders>
               <w:top w:val="single" w:sz="4" w:space="0" w:color="000000"/>
               <w:left w:val="single" w:sz="4" w:space="0" w:color="000000"/>
@@ -1114,7 +1517,7 @@
         </w:tc>
         <w:tc>
           <w:tcPr>
-            <w:tcW w:w="2394" w:type="dxa"/>
+            <w:tcW w:w="1134" w:type="dxa"/>
             <w:gridSpan w:val="2"/>
             <w:tcBorders>
               <w:top w:val="single" w:sz="4" w:space="0" w:color="000000"/>
@@ -1122,6 +1525,51 @@
               <w:bottom w:val="single" w:sz="4" w:space="0" w:color="000000"/>
               <w:right w:val="single" w:sz="4" w:space="0" w:color="000000"/>
             </w:tcBorders>
+          </w:tcPr>
+          <w:p>
+            <w:pPr>
+              <w:pStyle w:val="a9"/>
+              <w:jc w:val="center"/>
+              <w:rPr>
+                <w:sz w:val="16"/>
+                <w:szCs w:val="16"/>
+              </w:rPr>
+            </w:pPr>
+            <w:r>
+              <w:rPr>
+                <w:sz w:val="16"/>
+                <w:szCs w:val="16"/>
+              </w:rPr>
+              <w:t>${</w:t>
+            </w:r>
+            <w:proofErr w:type="spellStart"/>
+            <w:r>
+              <w:rPr>
+                <w:sz w:val="16"/>
+                <w:szCs w:val="16"/>
+              </w:rPr>
+              <w:t>cargo_row_pack_type</w:t>
+            </w:r>
+            <w:proofErr w:type="spellEnd"/>
+            <w:r>
+              <w:rPr>
+                <w:sz w:val="16"/>
+                <w:szCs w:val="16"/>
+              </w:rPr>
+              <w:t>}</w:t>
+            </w:r>
+          </w:p>
+        </w:tc>
+        <w:tc>
+          <w:tcPr>
+            <w:tcW w:w="2410" w:type="dxa"/>
+            <w:gridSpan w:val="2"/>
+            <w:tcBorders>
+              <w:top w:val="single" w:sz="4" w:space="0" w:color="000000"/>
+              <w:left w:val="single" w:sz="4" w:space="0" w:color="000000"/>
+              <w:bottom w:val="single" w:sz="4" w:space="0" w:color="000000"/>
+              <w:right w:val="single" w:sz="4" w:space="0" w:color="000000"/>
+            </w:tcBorders>
             <w:vAlign w:val="center"/>
           </w:tcPr>
           <w:p>
@@ -1160,7 +1608,7 @@
         </w:tc>
         <w:tc>
           <w:tcPr>
-            <w:tcW w:w="2568" w:type="dxa"/>
+            <w:tcW w:w="2552" w:type="dxa"/>
             <w:gridSpan w:val="2"/>
             <w:tcBorders>
               <w:top w:val="single" w:sz="4" w:space="0" w:color="000000"/>
@@ -1264,17 +1712,17 @@
         <w:tc>
           <w:tcPr>
             <w:tcW w:w="2126" w:type="dxa"/>
-            <w:tcBorders>
-              <w:top w:val="single" w:sz="4" w:space="0" w:color="000000"/>
-              <w:left w:val="single" w:sz="4" w:space="0" w:color="000000"/>
-              <w:bottom w:val="single" w:sz="4" w:space="0" w:color="000000"/>
-              <w:right w:val="single" w:sz="4" w:space="0" w:color="000000"/>
-            </w:tcBorders>
-          </w:tcPr>
-          <w:p>
-            <w:pPr>
-              <w:pStyle w:val="a9"/>
-              <w:jc w:val="center"/>
+            <w:gridSpan w:val="3"/>
+            <w:tcBorders>
+              <w:top w:val="single" w:sz="4" w:space="0" w:color="000000"/>
+              <w:left w:val="single" w:sz="4" w:space="0" w:color="000000"/>
+              <w:bottom w:val="single" w:sz="4" w:space="0" w:color="000000"/>
+              <w:right w:val="single" w:sz="4" w:space="0" w:color="000000"/>
+            </w:tcBorders>
+          </w:tcPr>
+          <w:p>
+            <w:pPr>
+              <w:pStyle w:val="a9"/>
               <w:rPr>
                 <w:sz w:val="16"/>
                 <w:szCs w:val="16"/>
@@ -1318,7 +1766,7 @@
         </w:tc>
         <w:tc>
           <w:tcPr>
-            <w:tcW w:w="1110" w:type="dxa"/>
+            <w:tcW w:w="1251" w:type="dxa"/>
             <w:tcBorders>
               <w:top w:val="single" w:sz="4" w:space="0" w:color="000000"/>
               <w:left w:val="single" w:sz="4" w:space="0" w:color="000000"/>
@@ -1345,7 +1793,7 @@
         </w:tc>
         <w:tc>
           <w:tcPr>
-            <w:tcW w:w="1284" w:type="dxa"/>
+            <w:tcW w:w="1159" w:type="dxa"/>
             <w:tcBorders>
               <w:top w:val="single" w:sz="4" w:space="0" w:color="000000"/>
               <w:left w:val="single" w:sz="4" w:space="0" w:color="000000"/>
@@ -1428,7 +1876,7 @@
         </w:tc>
         <w:tc>
           <w:tcPr>
-            <w:tcW w:w="1284" w:type="dxa"/>
+            <w:tcW w:w="1268" w:type="dxa"/>
             <w:tcBorders>
               <w:top w:val="single" w:sz="4" w:space="0" w:color="000000"/>
               <w:left w:val="single" w:sz="4" w:space="0" w:color="000000"/>
@@ -1523,7 +1971,28 @@
         </w:tc>
         <w:tc>
           <w:tcPr>
-            <w:tcW w:w="7088" w:type="dxa"/>
+            <w:tcW w:w="1554" w:type="dxa"/>
+            <w:gridSpan w:val="2"/>
+            <w:tcBorders>
+              <w:top w:val="single" w:sz="4" w:space="0" w:color="000000"/>
+              <w:left w:val="single" w:sz="4" w:space="0" w:color="000000"/>
+              <w:bottom w:val="single" w:sz="4" w:space="0" w:color="000000"/>
+              <w:right w:val="single" w:sz="4" w:space="0" w:color="000000"/>
+            </w:tcBorders>
+          </w:tcPr>
+          <w:p>
+            <w:pPr>
+              <w:pStyle w:val="a9"/>
+              <w:rPr>
+                <w:sz w:val="16"/>
+                <w:szCs w:val="16"/>
+              </w:rPr>
+            </w:pPr>
+          </w:p>
+        </w:tc>
+        <w:tc>
+          <w:tcPr>
+            <w:tcW w:w="5534" w:type="dxa"/>
             <w:gridSpan w:val="5"/>
             <w:tcBorders>
               <w:top w:val="single" w:sz="4" w:space="0" w:color="000000"/>
@@ -1626,7 +2095,28 @@
         </w:tc>
         <w:tc>
           <w:tcPr>
-            <w:tcW w:w="7088" w:type="dxa"/>
+            <w:tcW w:w="1554" w:type="dxa"/>
+            <w:gridSpan w:val="2"/>
+            <w:tcBorders>
+              <w:top w:val="single" w:sz="4" w:space="0" w:color="000000"/>
+              <w:left w:val="single" w:sz="4" w:space="0" w:color="000000"/>
+              <w:bottom w:val="single" w:sz="4" w:space="0" w:color="000000"/>
+              <w:right w:val="single" w:sz="4" w:space="0" w:color="000000"/>
+            </w:tcBorders>
+          </w:tcPr>
+          <w:p>
+            <w:pPr>
+              <w:pStyle w:val="a9"/>
+              <w:rPr>
+                <w:sz w:val="16"/>
+                <w:szCs w:val="16"/>
+              </w:rPr>
+            </w:pPr>
+          </w:p>
+        </w:tc>
+        <w:tc>
+          <w:tcPr>
+            <w:tcW w:w="5534" w:type="dxa"/>
             <w:gridSpan w:val="5"/>
             <w:tcBorders>
               <w:top w:val="single" w:sz="4" w:space="0" w:color="000000"/>
@@ -1798,6 +2288,7 @@
         <w:tc>
           <w:tcPr>
             <w:tcW w:w="2126" w:type="dxa"/>
+            <w:gridSpan w:val="3"/>
             <w:tcBorders>
               <w:top w:val="single" w:sz="4" w:space="0" w:color="000000"/>
               <w:left w:val="single" w:sz="4" w:space="0" w:color="000000"/>
@@ -1812,6 +2303,7 @@
               <w:rPr>
                 <w:sz w:val="16"/>
                 <w:szCs w:val="16"/>
+                <w:lang w:val="en-US"/>
               </w:rPr>
             </w:pPr>
             <w:r>
@@ -1826,14 +2318,7 @@
                 <w:sz w:val="16"/>
                 <w:szCs w:val="16"/>
               </w:rPr>
-              <w:t xml:space="preserve">.1. </w:t>
-            </w:r>
-            <w:r>
-              <w:rPr>
-                <w:sz w:val="16"/>
-                <w:szCs w:val="16"/>
-              </w:rPr>
-              <w:t xml:space="preserve">Требования к ТС </w:t>
+              <w:t xml:space="preserve">.1. Требования к ТС </w:t>
             </w:r>
           </w:p>
         </w:tc>
@@ -1935,6 +2420,7 @@
         <w:tc>
           <w:tcPr>
             <w:tcW w:w="2126" w:type="dxa"/>
+            <w:gridSpan w:val="3"/>
             <w:tcBorders>
               <w:top w:val="single" w:sz="4" w:space="0" w:color="000000"/>
               <w:left w:val="single" w:sz="4" w:space="0" w:color="000000"/>
@@ -1963,14 +2449,7 @@
                 <w:sz w:val="16"/>
                 <w:szCs w:val="16"/>
               </w:rPr>
-              <w:t xml:space="preserve">.2. </w:t>
-            </w:r>
-            <w:r>
-              <w:rPr>
-                <w:sz w:val="16"/>
-                <w:szCs w:val="16"/>
-              </w:rPr>
-              <w:t>Класс опасности</w:t>
+              <w:t>.2. Класс опасности</w:t>
             </w:r>
           </w:p>
         </w:tc>
@@ -2067,34 +2546,28 @@
         <w:tc>
           <w:tcPr>
             <w:tcW w:w="2126" w:type="dxa"/>
-            <w:tcBorders>
-              <w:top w:val="single" w:sz="4" w:space="0" w:color="000000"/>
-              <w:left w:val="single" w:sz="4" w:space="0" w:color="000000"/>
-              <w:bottom w:val="single" w:sz="4" w:space="0" w:color="000000"/>
-              <w:right w:val="single" w:sz="4" w:space="0" w:color="000000"/>
-            </w:tcBorders>
-          </w:tcPr>
-          <w:p>
-            <w:pPr>
-              <w:pStyle w:val="a9"/>
-              <w:rPr>
-                <w:sz w:val="16"/>
-                <w:szCs w:val="16"/>
-              </w:rPr>
-            </w:pPr>
-            <w:r>
-              <w:rPr>
-                <w:sz w:val="16"/>
-                <w:szCs w:val="16"/>
-              </w:rPr>
-              <w:t>6</w:t>
-            </w:r>
-            <w:r>
-              <w:rPr>
-                <w:sz w:val="16"/>
-                <w:szCs w:val="16"/>
-              </w:rPr>
-              <w:t xml:space="preserve">.4 </w:t>
+            <w:gridSpan w:val="3"/>
+            <w:tcBorders>
+              <w:top w:val="single" w:sz="4" w:space="0" w:color="000000"/>
+              <w:left w:val="single" w:sz="4" w:space="0" w:color="000000"/>
+              <w:bottom w:val="single" w:sz="4" w:space="0" w:color="000000"/>
+              <w:right w:val="single" w:sz="4" w:space="0" w:color="000000"/>
+            </w:tcBorders>
+          </w:tcPr>
+          <w:p>
+            <w:pPr>
+              <w:pStyle w:val="a9"/>
+              <w:rPr>
+                <w:sz w:val="16"/>
+                <w:szCs w:val="16"/>
+              </w:rPr>
+            </w:pPr>
+            <w:r>
+              <w:rPr>
+                <w:sz w:val="16"/>
+                <w:szCs w:val="16"/>
+              </w:rPr>
+              <w:t xml:space="preserve">6.4 </w:t>
             </w:r>
             <w:r>
               <w:rPr>
@@ -2174,34 +2647,28 @@
         <w:tc>
           <w:tcPr>
             <w:tcW w:w="2126" w:type="dxa"/>
-            <w:tcBorders>
-              <w:top w:val="single" w:sz="4" w:space="0" w:color="000000"/>
-              <w:left w:val="single" w:sz="4" w:space="0" w:color="000000"/>
-              <w:bottom w:val="single" w:sz="4" w:space="0" w:color="000000"/>
-              <w:right w:val="single" w:sz="4" w:space="0" w:color="000000"/>
-            </w:tcBorders>
-          </w:tcPr>
-          <w:p>
-            <w:pPr>
-              <w:pStyle w:val="a9"/>
-              <w:rPr>
-                <w:sz w:val="16"/>
-                <w:szCs w:val="16"/>
-              </w:rPr>
-            </w:pPr>
-            <w:r>
-              <w:rPr>
-                <w:sz w:val="16"/>
-                <w:szCs w:val="16"/>
-              </w:rPr>
-              <w:t>6</w:t>
-            </w:r>
-            <w:r>
-              <w:rPr>
-                <w:sz w:val="16"/>
-                <w:szCs w:val="16"/>
-              </w:rPr>
-              <w:t>.5. Д</w:t>
+            <w:gridSpan w:val="3"/>
+            <w:tcBorders>
+              <w:top w:val="single" w:sz="4" w:space="0" w:color="000000"/>
+              <w:left w:val="single" w:sz="4" w:space="0" w:color="000000"/>
+              <w:bottom w:val="single" w:sz="4" w:space="0" w:color="000000"/>
+              <w:right w:val="single" w:sz="4" w:space="0" w:color="000000"/>
+            </w:tcBorders>
+          </w:tcPr>
+          <w:p>
+            <w:pPr>
+              <w:pStyle w:val="a9"/>
+              <w:rPr>
+                <w:sz w:val="16"/>
+                <w:szCs w:val="16"/>
+              </w:rPr>
+            </w:pPr>
+            <w:r>
+              <w:rPr>
+                <w:sz w:val="16"/>
+                <w:szCs w:val="16"/>
+              </w:rPr>
+              <w:t>6.5. Д</w:t>
             </w:r>
             <w:r>
               <w:rPr>
@@ -2249,7 +2716,23 @@
           <w:sz w:val="20"/>
           <w:szCs w:val="20"/>
         </w:rPr>
-        <w:t>ПОГРУЗКА И ТАМОЖЕННОЕ ОФОРМЛЕНИЕ</w:t>
+        <w:t xml:space="preserve">ПОГРУЗКА </w:t>
+      </w:r>
+      <w:r>
+        <w:rPr>
+          <w:b/>
+          <w:sz w:val="20"/>
+          <w:szCs w:val="20"/>
+        </w:rPr>
+        <w:t xml:space="preserve">/ </w:t>
+      </w:r>
+      <w:r>
+        <w:rPr>
+          <w:b/>
+          <w:sz w:val="20"/>
+          <w:szCs w:val="20"/>
+        </w:rPr>
+        <w:t>РАЗГРУЗКА</w:t>
       </w:r>
     </w:p>
     <w:tbl>
@@ -2261,8 +2744,12 @@
       </w:tblPr>
       <w:tblGrid>
         <w:gridCol w:w="421"/>
-        <w:gridCol w:w="3118"/>
-        <w:gridCol w:w="7088"/>
+        <w:gridCol w:w="1275"/>
+        <w:gridCol w:w="1458"/>
+        <w:gridCol w:w="2370"/>
+        <w:gridCol w:w="1458"/>
+        <w:gridCol w:w="1944"/>
+        <w:gridCol w:w="1701"/>
       </w:tblGrid>
       <w:tr>
         <w:tc>
@@ -2275,7 +2762,6 @@
               <w:right w:val="single" w:sz="4" w:space="0" w:color="000000"/>
             </w:tcBorders>
             <w:vAlign w:val="center"/>
-            <w:hideMark/>
           </w:tcPr>
           <w:p>
             <w:pPr>
@@ -2296,78 +2782,182 @@
         </w:tc>
         <w:tc>
           <w:tcPr>
-            <w:tcW w:w="3118" w:type="dxa"/>
-            <w:tcBorders>
-              <w:top w:val="single" w:sz="4" w:space="0" w:color="000000"/>
-              <w:left w:val="single" w:sz="4" w:space="0" w:color="000000"/>
-              <w:bottom w:val="single" w:sz="4" w:space="0" w:color="000000"/>
-              <w:right w:val="single" w:sz="4" w:space="0" w:color="000000"/>
-            </w:tcBorders>
-            <w:hideMark/>
-          </w:tcPr>
-          <w:p>
-            <w:pPr>
-              <w:pStyle w:val="a9"/>
-              <w:rPr>
-                <w:sz w:val="16"/>
-                <w:szCs w:val="16"/>
-              </w:rPr>
-            </w:pPr>
-            <w:r>
-              <w:rPr>
-                <w:sz w:val="16"/>
-                <w:szCs w:val="16"/>
-              </w:rPr>
-              <w:t>Грузоотправитель</w:t>
-            </w:r>
-          </w:p>
-        </w:tc>
-        <w:tc>
-          <w:tcPr>
-            <w:tcW w:w="7088" w:type="dxa"/>
-            <w:tcBorders>
-              <w:top w:val="single" w:sz="4" w:space="0" w:color="000000"/>
-              <w:left w:val="single" w:sz="4" w:space="0" w:color="000000"/>
-              <w:bottom w:val="single" w:sz="4" w:space="0" w:color="000000"/>
-              <w:right w:val="single" w:sz="4" w:space="0" w:color="000000"/>
-            </w:tcBorders>
-            <w:hideMark/>
-          </w:tcPr>
-          <w:p>
-            <w:pPr>
-              <w:pStyle w:val="a9"/>
-              <w:rPr>
-                <w:bCs/>
-                <w:sz w:val="16"/>
-                <w:szCs w:val="16"/>
-                <w:lang w:val="en-US"/>
-              </w:rPr>
-            </w:pPr>
-            <w:r>
-              <w:rPr>
-                <w:sz w:val="16"/>
-                <w:szCs w:val="16"/>
-                <w:lang w:val="en-US"/>
-              </w:rPr>
-              <w:t>${</w:t>
-            </w:r>
-            <w:proofErr w:type="spellStart"/>
-            <w:r>
-              <w:rPr>
-                <w:sz w:val="16"/>
-                <w:szCs w:val="16"/>
-                <w:lang w:val="en-US"/>
-              </w:rPr>
-              <w:t>gruzootpavitel</w:t>
-            </w:r>
-            <w:proofErr w:type="spellEnd"/>
-            <w:r>
-              <w:rPr>
-                <w:sz w:val="16"/>
-                <w:szCs w:val="16"/>
-                <w:lang w:val="en-US"/>
-              </w:rPr>
-              <w:t>}</w:t>
+            <w:tcW w:w="1275" w:type="dxa"/>
+            <w:tcBorders>
+              <w:top w:val="single" w:sz="4" w:space="0" w:color="000000"/>
+              <w:left w:val="single" w:sz="4" w:space="0" w:color="000000"/>
+              <w:bottom w:val="single" w:sz="4" w:space="0" w:color="000000"/>
+              <w:right w:val="single" w:sz="4" w:space="0" w:color="000000"/>
+            </w:tcBorders>
+          </w:tcPr>
+          <w:p>
+            <w:pPr>
+              <w:pStyle w:val="a9"/>
+              <w:jc w:val="center"/>
+              <w:rPr>
+                <w:bCs/>
+                <w:sz w:val="16"/>
+                <w:szCs w:val="16"/>
+              </w:rPr>
+            </w:pPr>
+            <w:r>
+              <w:rPr>
+                <w:bCs/>
+                <w:sz w:val="16"/>
+                <w:szCs w:val="16"/>
+              </w:rPr>
+              <w:t>Тип</w:t>
+            </w:r>
+          </w:p>
+        </w:tc>
+        <w:tc>
+          <w:tcPr>
+            <w:tcW w:w="1458" w:type="dxa"/>
+            <w:tcBorders>
+              <w:top w:val="single" w:sz="4" w:space="0" w:color="000000"/>
+              <w:left w:val="single" w:sz="4" w:space="0" w:color="000000"/>
+              <w:bottom w:val="single" w:sz="4" w:space="0" w:color="000000"/>
+              <w:right w:val="single" w:sz="4" w:space="0" w:color="000000"/>
+            </w:tcBorders>
+          </w:tcPr>
+          <w:p>
+            <w:pPr>
+              <w:pStyle w:val="a9"/>
+              <w:jc w:val="center"/>
+              <w:rPr>
+                <w:bCs/>
+                <w:sz w:val="16"/>
+                <w:szCs w:val="16"/>
+              </w:rPr>
+            </w:pPr>
+            <w:r>
+              <w:rPr>
+                <w:bCs/>
+                <w:sz w:val="16"/>
+                <w:szCs w:val="16"/>
+              </w:rPr>
+              <w:t>Город</w:t>
+            </w:r>
+          </w:p>
+        </w:tc>
+        <w:tc>
+          <w:tcPr>
+            <w:tcW w:w="2370" w:type="dxa"/>
+            <w:tcBorders>
+              <w:top w:val="single" w:sz="4" w:space="0" w:color="000000"/>
+              <w:left w:val="single" w:sz="4" w:space="0" w:color="000000"/>
+              <w:bottom w:val="single" w:sz="4" w:space="0" w:color="000000"/>
+              <w:right w:val="single" w:sz="4" w:space="0" w:color="000000"/>
+            </w:tcBorders>
+          </w:tcPr>
+          <w:p>
+            <w:pPr>
+              <w:pStyle w:val="a9"/>
+              <w:jc w:val="center"/>
+              <w:rPr>
+                <w:bCs/>
+                <w:sz w:val="16"/>
+                <w:szCs w:val="16"/>
+              </w:rPr>
+            </w:pPr>
+            <w:r>
+              <w:rPr>
+                <w:bCs/>
+                <w:sz w:val="16"/>
+                <w:szCs w:val="16"/>
+              </w:rPr>
+              <w:t>Адрес</w:t>
+            </w:r>
+          </w:p>
+        </w:tc>
+        <w:tc>
+          <w:tcPr>
+            <w:tcW w:w="1458" w:type="dxa"/>
+            <w:tcBorders>
+              <w:top w:val="single" w:sz="4" w:space="0" w:color="000000"/>
+              <w:left w:val="single" w:sz="4" w:space="0" w:color="000000"/>
+              <w:bottom w:val="single" w:sz="4" w:space="0" w:color="000000"/>
+              <w:right w:val="single" w:sz="4" w:space="0" w:color="000000"/>
+            </w:tcBorders>
+          </w:tcPr>
+          <w:p>
+            <w:pPr>
+              <w:pStyle w:val="a9"/>
+              <w:jc w:val="center"/>
+              <w:rPr>
+                <w:bCs/>
+                <w:sz w:val="16"/>
+                <w:szCs w:val="16"/>
+              </w:rPr>
+            </w:pPr>
+            <w:r>
+              <w:rPr>
+                <w:bCs/>
+                <w:sz w:val="16"/>
+                <w:szCs w:val="16"/>
+              </w:rPr>
+              <w:t>Отправитель/получатель</w:t>
+            </w:r>
+          </w:p>
+        </w:tc>
+        <w:tc>
+          <w:tcPr>
+            <w:tcW w:w="1944" w:type="dxa"/>
+            <w:tcBorders>
+              <w:top w:val="single" w:sz="4" w:space="0" w:color="000000"/>
+              <w:left w:val="single" w:sz="4" w:space="0" w:color="000000"/>
+              <w:bottom w:val="single" w:sz="4" w:space="0" w:color="000000"/>
+              <w:right w:val="single" w:sz="4" w:space="0" w:color="000000"/>
+            </w:tcBorders>
+          </w:tcPr>
+          <w:p>
+            <w:pPr>
+              <w:pStyle w:val="a9"/>
+              <w:jc w:val="center"/>
+              <w:rPr>
+                <w:bCs/>
+                <w:sz w:val="16"/>
+                <w:szCs w:val="16"/>
+              </w:rPr>
+            </w:pPr>
+            <w:r>
+              <w:rPr>
+                <w:bCs/>
+                <w:sz w:val="16"/>
+                <w:szCs w:val="16"/>
+              </w:rPr>
+              <w:t>Контакт</w:t>
+            </w:r>
+          </w:p>
+        </w:tc>
+        <w:tc>
+          <w:tcPr>
+            <w:tcW w:w="1701" w:type="dxa"/>
+            <w:tcBorders>
+              <w:top w:val="single" w:sz="4" w:space="0" w:color="000000"/>
+              <w:left w:val="single" w:sz="4" w:space="0" w:color="000000"/>
+              <w:bottom w:val="single" w:sz="4" w:space="0" w:color="000000"/>
+              <w:right w:val="single" w:sz="4" w:space="0" w:color="000000"/>
+            </w:tcBorders>
+          </w:tcPr>
+          <w:p>
+            <w:pPr>
+              <w:pStyle w:val="a9"/>
+              <w:ind w:hanging="23"/>
+              <w:jc w:val="center"/>
+              <w:rPr>
+                <w:bCs/>
+                <w:sz w:val="16"/>
+                <w:szCs w:val="16"/>
+              </w:rPr>
+            </w:pPr>
+            <w:r>
+              <w:rPr>
+                <w:bCs/>
+                <w:sz w:val="16"/>
+                <w:szCs w:val="16"/>
+              </w:rPr>
+              <w:t>Дата / время</w:t>
             </w:r>
           </w:p>
         </w:tc>
@@ -2383,198 +2973,311 @@
               <w:right w:val="single" w:sz="4" w:space="0" w:color="000000"/>
             </w:tcBorders>
             <w:vAlign w:val="center"/>
-            <w:hideMark/>
-          </w:tcPr>
-          <w:p>
-            <w:pPr>
-              <w:pStyle w:val="a9"/>
-              <w:rPr>
-                <w:sz w:val="16"/>
-                <w:szCs w:val="16"/>
-              </w:rPr>
-            </w:pPr>
-            <w:r>
-              <w:rPr>
-                <w:sz w:val="16"/>
-                <w:szCs w:val="16"/>
-              </w:rPr>
-              <w:t>8</w:t>
-            </w:r>
-          </w:p>
-        </w:tc>
-        <w:tc>
-          <w:tcPr>
-            <w:tcW w:w="3118" w:type="dxa"/>
-            <w:tcBorders>
-              <w:top w:val="single" w:sz="4" w:space="0" w:color="000000"/>
-              <w:left w:val="single" w:sz="4" w:space="0" w:color="000000"/>
-              <w:bottom w:val="single" w:sz="4" w:space="0" w:color="000000"/>
-              <w:right w:val="single" w:sz="4" w:space="0" w:color="000000"/>
-            </w:tcBorders>
-            <w:hideMark/>
-          </w:tcPr>
-          <w:p>
-            <w:pPr>
-              <w:pStyle w:val="a9"/>
-              <w:rPr>
-                <w:sz w:val="16"/>
-                <w:szCs w:val="16"/>
-              </w:rPr>
-            </w:pPr>
-            <w:r>
-              <w:rPr>
-                <w:sz w:val="16"/>
-                <w:szCs w:val="16"/>
-              </w:rPr>
-              <w:t>Адрес места погрузки</w:t>
-            </w:r>
-          </w:p>
-        </w:tc>
-        <w:tc>
-          <w:tcPr>
-            <w:tcW w:w="7088" w:type="dxa"/>
-            <w:tcBorders>
-              <w:top w:val="single" w:sz="4" w:space="0" w:color="000000"/>
-              <w:left w:val="single" w:sz="4" w:space="0" w:color="000000"/>
-              <w:bottom w:val="single" w:sz="4" w:space="0" w:color="000000"/>
-              <w:right w:val="single" w:sz="4" w:space="0" w:color="000000"/>
-            </w:tcBorders>
-            <w:hideMark/>
-          </w:tcPr>
-          <w:p>
-            <w:pPr>
-              <w:pStyle w:val="a9"/>
-              <w:rPr>
-                <w:sz w:val="16"/>
-                <w:szCs w:val="16"/>
-              </w:rPr>
-            </w:pPr>
-            <w:r>
-              <w:rPr>
-                <w:sz w:val="16"/>
-                <w:szCs w:val="16"/>
-                <w:lang w:val="en-US"/>
+          </w:tcPr>
+          <w:p>
+            <w:pPr>
+              <w:pStyle w:val="a9"/>
+              <w:jc w:val="center"/>
+              <w:rPr>
+                <w:sz w:val="14"/>
+                <w:szCs w:val="14"/>
+              </w:rPr>
+            </w:pPr>
+            <w:r>
+              <w:rPr>
+                <w:sz w:val="14"/>
+                <w:szCs w:val="14"/>
               </w:rPr>
               <w:t>${</w:t>
             </w:r>
             <w:proofErr w:type="spellStart"/>
             <w:r>
               <w:rPr>
-                <w:sz w:val="16"/>
-                <w:szCs w:val="16"/>
-                <w:lang w:val="en-US"/>
-              </w:rPr>
-              <w:t>address_zagruzki</w:t>
+                <w:sz w:val="14"/>
+                <w:szCs w:val="14"/>
+              </w:rPr>
+              <w:t>route_point_row_index</w:t>
             </w:r>
             <w:proofErr w:type="spellEnd"/>
             <w:r>
               <w:rPr>
-                <w:sz w:val="16"/>
-                <w:szCs w:val="16"/>
-                <w:lang w:val="en-US"/>
+                <w:sz w:val="14"/>
+                <w:szCs w:val="14"/>
               </w:rPr>
               <w:t>}</w:t>
             </w:r>
           </w:p>
         </w:tc>
-      </w:tr>
-      <w:tr>
-        <w:tc>
-          <w:tcPr>
-            <w:tcW w:w="421" w:type="dxa"/>
-            <w:tcBorders>
-              <w:top w:val="single" w:sz="4" w:space="0" w:color="000000"/>
-              <w:left w:val="single" w:sz="4" w:space="0" w:color="000000"/>
-              <w:bottom w:val="single" w:sz="4" w:space="0" w:color="000000"/>
-              <w:right w:val="single" w:sz="4" w:space="0" w:color="000000"/>
-            </w:tcBorders>
-            <w:vAlign w:val="center"/>
-            <w:hideMark/>
-          </w:tcPr>
-          <w:p>
-            <w:pPr>
-              <w:pStyle w:val="a9"/>
-              <w:rPr>
-                <w:sz w:val="16"/>
-                <w:szCs w:val="16"/>
-              </w:rPr>
-            </w:pPr>
-            <w:r>
-              <w:rPr>
-                <w:sz w:val="16"/>
-                <w:szCs w:val="16"/>
-              </w:rPr>
-              <w:t>9</w:t>
-            </w:r>
-          </w:p>
-        </w:tc>
-        <w:tc>
-          <w:tcPr>
-            <w:tcW w:w="3118" w:type="dxa"/>
-            <w:tcBorders>
-              <w:top w:val="single" w:sz="4" w:space="0" w:color="000000"/>
-              <w:left w:val="single" w:sz="4" w:space="0" w:color="000000"/>
-              <w:bottom w:val="single" w:sz="4" w:space="0" w:color="000000"/>
-              <w:right w:val="single" w:sz="4" w:space="0" w:color="000000"/>
-            </w:tcBorders>
-            <w:hideMark/>
-          </w:tcPr>
-          <w:p>
-            <w:pPr>
-              <w:pStyle w:val="a9"/>
-              <w:rPr>
-                <w:sz w:val="16"/>
-                <w:szCs w:val="16"/>
-              </w:rPr>
-            </w:pPr>
-            <w:r>
-              <w:rPr>
-                <w:sz w:val="16"/>
-                <w:szCs w:val="16"/>
-              </w:rPr>
-              <w:t>Дата погрузки</w:t>
-            </w:r>
-          </w:p>
-        </w:tc>
-        <w:tc>
-          <w:tcPr>
-            <w:tcW w:w="7088" w:type="dxa"/>
-            <w:tcBorders>
-              <w:top w:val="single" w:sz="4" w:space="0" w:color="000000"/>
-              <w:left w:val="single" w:sz="4" w:space="0" w:color="000000"/>
-              <w:bottom w:val="single" w:sz="4" w:space="0" w:color="000000"/>
-              <w:right w:val="single" w:sz="4" w:space="0" w:color="000000"/>
-            </w:tcBorders>
-            <w:hideMark/>
-          </w:tcPr>
-          <w:p>
-            <w:pPr>
-              <w:pStyle w:val="a9"/>
-              <w:rPr>
-                <w:sz w:val="16"/>
-                <w:szCs w:val="16"/>
-              </w:rPr>
-            </w:pPr>
-            <w:r>
-              <w:rPr>
-                <w:sz w:val="16"/>
-                <w:szCs w:val="16"/>
-                <w:lang w:val="en-US"/>
+        <w:tc>
+          <w:tcPr>
+            <w:tcW w:w="1275" w:type="dxa"/>
+            <w:tcBorders>
+              <w:top w:val="single" w:sz="4" w:space="0" w:color="000000"/>
+              <w:left w:val="single" w:sz="4" w:space="0" w:color="000000"/>
+              <w:bottom w:val="single" w:sz="4" w:space="0" w:color="000000"/>
+              <w:right w:val="single" w:sz="4" w:space="0" w:color="000000"/>
+            </w:tcBorders>
+          </w:tcPr>
+          <w:p>
+            <w:pPr>
+              <w:pStyle w:val="a9"/>
+              <w:rPr>
+                <w:bCs/>
+                <w:sz w:val="16"/>
+                <w:szCs w:val="16"/>
+                <w:lang w:val="fr-FR"/>
+              </w:rPr>
+            </w:pPr>
+            <w:r>
+              <w:rPr>
+                <w:bCs/>
+                <w:sz w:val="16"/>
+                <w:szCs w:val="16"/>
+                <w:lang w:val="fr-FR"/>
+              </w:rPr>
+              <w:t>${route_point_row_type_label}</w:t>
+            </w:r>
+          </w:p>
+        </w:tc>
+        <w:tc>
+          <w:tcPr>
+            <w:tcW w:w="1458" w:type="dxa"/>
+            <w:tcBorders>
+              <w:top w:val="single" w:sz="4" w:space="0" w:color="000000"/>
+              <w:left w:val="single" w:sz="4" w:space="0" w:color="000000"/>
+              <w:bottom w:val="single" w:sz="4" w:space="0" w:color="000000"/>
+              <w:right w:val="single" w:sz="4" w:space="0" w:color="000000"/>
+            </w:tcBorders>
+          </w:tcPr>
+          <w:p>
+            <w:pPr>
+              <w:pStyle w:val="a9"/>
+              <w:rPr>
+                <w:bCs/>
+                <w:sz w:val="16"/>
+                <w:szCs w:val="16"/>
+                <w:lang w:val="fr-FR"/>
+              </w:rPr>
+            </w:pPr>
+            <w:r>
+              <w:rPr>
+                <w:bCs/>
+                <w:sz w:val="16"/>
+                <w:szCs w:val="16"/>
               </w:rPr>
               <w:t>${</w:t>
             </w:r>
             <w:proofErr w:type="spellStart"/>
             <w:r>
               <w:rPr>
-                <w:sz w:val="16"/>
-                <w:szCs w:val="16"/>
-                <w:lang w:val="en-US"/>
-              </w:rPr>
-              <w:t>data_zagruzki</w:t>
+                <w:bCs/>
+                <w:sz w:val="16"/>
+                <w:szCs w:val="16"/>
+              </w:rPr>
+              <w:t>route_point_row_city</w:t>
             </w:r>
             <w:proofErr w:type="spellEnd"/>
             <w:r>
               <w:rPr>
+                <w:bCs/>
+                <w:sz w:val="16"/>
+                <w:szCs w:val="16"/>
+              </w:rPr>
+              <w:t>}</w:t>
+            </w:r>
+          </w:p>
+        </w:tc>
+        <w:tc>
+          <w:tcPr>
+            <w:tcW w:w="2370" w:type="dxa"/>
+            <w:tcBorders>
+              <w:top w:val="single" w:sz="4" w:space="0" w:color="000000"/>
+              <w:left w:val="single" w:sz="4" w:space="0" w:color="000000"/>
+              <w:bottom w:val="single" w:sz="4" w:space="0" w:color="000000"/>
+              <w:right w:val="single" w:sz="4" w:space="0" w:color="000000"/>
+            </w:tcBorders>
+          </w:tcPr>
+          <w:p>
+            <w:pPr>
+              <w:pStyle w:val="a9"/>
+              <w:rPr>
+                <w:bCs/>
+                <w:sz w:val="16"/>
+                <w:szCs w:val="16"/>
+                <w:lang w:val="fr-FR"/>
+              </w:rPr>
+            </w:pPr>
+            <w:r>
+              <w:rPr>
+                <w:bCs/>
+                <w:sz w:val="16"/>
+                <w:szCs w:val="16"/>
+              </w:rPr>
+              <w:t>${</w:t>
+            </w:r>
+            <w:proofErr w:type="spellStart"/>
+            <w:r>
+              <w:rPr>
+                <w:bCs/>
+                <w:sz w:val="16"/>
+                <w:szCs w:val="16"/>
+              </w:rPr>
+              <w:t>route_point_row_address</w:t>
+            </w:r>
+            <w:proofErr w:type="spellEnd"/>
+            <w:r>
+              <w:rPr>
+                <w:bCs/>
+                <w:sz w:val="16"/>
+                <w:szCs w:val="16"/>
+              </w:rPr>
+              <w:t>}</w:t>
+            </w:r>
+          </w:p>
+        </w:tc>
+        <w:tc>
+          <w:tcPr>
+            <w:tcW w:w="1458" w:type="dxa"/>
+            <w:tcBorders>
+              <w:top w:val="single" w:sz="4" w:space="0" w:color="000000"/>
+              <w:left w:val="single" w:sz="4" w:space="0" w:color="000000"/>
+              <w:bottom w:val="single" w:sz="4" w:space="0" w:color="000000"/>
+              <w:right w:val="single" w:sz="4" w:space="0" w:color="000000"/>
+            </w:tcBorders>
+          </w:tcPr>
+          <w:p>
+            <w:pPr>
+              <w:pStyle w:val="a9"/>
+              <w:rPr>
+                <w:bCs/>
+                <w:sz w:val="16"/>
+                <w:szCs w:val="16"/>
+                <w:lang w:val="en-US"/>
+              </w:rPr>
+            </w:pPr>
+            <w:r>
+              <w:rPr>
+                <w:bCs/>
+                <w:sz w:val="16"/>
+                <w:szCs w:val="16"/>
+                <w:lang w:val="en-US"/>
+              </w:rPr>
+              <w:t>${</w:t>
+            </w:r>
+            <w:proofErr w:type="spellStart"/>
+            <w:r>
+              <w:rPr>
+                <w:bCs/>
+                <w:sz w:val="16"/>
+                <w:szCs w:val="16"/>
+                <w:lang w:val="en-US"/>
+              </w:rPr>
+              <w:t>route_point_row_party_name</w:t>
+            </w:r>
+            <w:proofErr w:type="spellEnd"/>
+            <w:r>
+              <w:rPr>
+                <w:bCs/>
+                <w:sz w:val="16"/>
+                <w:szCs w:val="16"/>
+                <w:lang w:val="en-US"/>
+              </w:rPr>
+              <w:t>}</w:t>
+            </w:r>
+          </w:p>
+        </w:tc>
+        <w:tc>
+          <w:tcPr>
+            <w:tcW w:w="1944" w:type="dxa"/>
+            <w:tcBorders>
+              <w:top w:val="single" w:sz="4" w:space="0" w:color="000000"/>
+              <w:left w:val="single" w:sz="4" w:space="0" w:color="000000"/>
+              <w:bottom w:val="single" w:sz="4" w:space="0" w:color="000000"/>
+              <w:right w:val="single" w:sz="4" w:space="0" w:color="000000"/>
+            </w:tcBorders>
+          </w:tcPr>
+          <w:p>
+            <w:pPr>
+              <w:pStyle w:val="a9"/>
+              <w:rPr>
+                <w:bCs/>
+                <w:sz w:val="16"/>
+                <w:szCs w:val="16"/>
+                <w:lang w:val="en-US"/>
+              </w:rPr>
+            </w:pPr>
+            <w:r>
+              <w:rPr>
+                <w:bCs/>
+                <w:sz w:val="16"/>
+                <w:szCs w:val="16"/>
+              </w:rPr>
+              <w:t>${</w:t>
+            </w:r>
+            <w:proofErr w:type="spellStart"/>
+            <w:r>
+              <w:rPr>
+                <w:bCs/>
+                <w:sz w:val="16"/>
+                <w:szCs w:val="16"/>
+              </w:rPr>
+              <w:t>route_point_row_contact_phone</w:t>
+            </w:r>
+            <w:proofErr w:type="spellEnd"/>
+            <w:r>
+              <w:rPr>
+                <w:bCs/>
+                <w:sz w:val="16"/>
+                <w:szCs w:val="16"/>
+              </w:rPr>
+              <w:t>}</w:t>
+            </w:r>
+          </w:p>
+        </w:tc>
+        <w:tc>
+          <w:tcPr>
+            <w:tcW w:w="1701" w:type="dxa"/>
+            <w:tcBorders>
+              <w:top w:val="single" w:sz="4" w:space="0" w:color="000000"/>
+              <w:left w:val="single" w:sz="4" w:space="0" w:color="000000"/>
+              <w:bottom w:val="single" w:sz="4" w:space="0" w:color="000000"/>
+              <w:right w:val="single" w:sz="4" w:space="0" w:color="000000"/>
+            </w:tcBorders>
+          </w:tcPr>
+          <w:p>
+            <w:pPr>
+              <w:pStyle w:val="a9"/>
+              <w:ind w:hanging="23"/>
+              <w:rPr>
+                <w:bCs/>
+                <w:sz w:val="16"/>
+                <w:szCs w:val="16"/>
+                <w:lang w:val="en-US"/>
+              </w:rPr>
+            </w:pPr>
+            <w:r>
+              <w:rPr>
+                <w:bCs/>
+                <w:sz w:val="16"/>
+                <w:szCs w:val="16"/>
+                <w:lang w:val="en-US"/>
+              </w:rPr>
+              <w:t>${</w:t>
+            </w:r>
+            <w:proofErr w:type="spellStart"/>
+            <w:r>
+              <w:rPr>
+                <w:bCs/>
+                <w:sz w:val="16"/>
+                <w:szCs w:val="16"/>
+                <w:lang w:val="en-US"/>
+              </w:rPr>
+              <w:t>route_point_row_planned_date</w:t>
+            </w:r>
+            <w:proofErr w:type="spellEnd"/>
+            <w:r>
+              <w:rPr>
+                <w:bCs/>
                 <w:sz w:val="16"/>
                 <w:szCs w:val="16"/>
                 <w:lang w:val="en-US"/>
@@ -2584,228 +3287,20 @@
             <w:proofErr w:type="spellStart"/>
             <w:r>
               <w:rPr>
-                <w:sz w:val="16"/>
-                <w:szCs w:val="16"/>
-                <w:lang w:val="en-US"/>
-              </w:rPr>
-              <w:t>vremya_zagruzki</w:t>
+                <w:bCs/>
+                <w:sz w:val="16"/>
+                <w:szCs w:val="16"/>
+                <w:lang w:val="en-US"/>
+              </w:rPr>
+              <w:t>route_point_row_time_range</w:t>
             </w:r>
             <w:proofErr w:type="spellEnd"/>
             <w:r>
               <w:rPr>
-                <w:sz w:val="16"/>
-                <w:szCs w:val="16"/>
-                <w:lang w:val="en-US"/>
-              </w:rPr>
-              <w:t>}</w:t>
-            </w:r>
-          </w:p>
-        </w:tc>
-      </w:tr>
-      <w:tr>
-        <w:tc>
-          <w:tcPr>
-            <w:tcW w:w="421" w:type="dxa"/>
-            <w:tcBorders>
-              <w:top w:val="single" w:sz="4" w:space="0" w:color="000000"/>
-              <w:left w:val="single" w:sz="4" w:space="0" w:color="000000"/>
-              <w:bottom w:val="single" w:sz="4" w:space="0" w:color="000000"/>
-              <w:right w:val="single" w:sz="4" w:space="0" w:color="000000"/>
-            </w:tcBorders>
-            <w:vAlign w:val="center"/>
-            <w:hideMark/>
-          </w:tcPr>
-          <w:p>
-            <w:pPr>
-              <w:pStyle w:val="a9"/>
-              <w:rPr>
-                <w:sz w:val="16"/>
-                <w:szCs w:val="16"/>
-              </w:rPr>
-            </w:pPr>
-            <w:r>
-              <w:rPr>
-                <w:sz w:val="16"/>
-                <w:szCs w:val="16"/>
-              </w:rPr>
-              <w:t>10</w:t>
-            </w:r>
-          </w:p>
-        </w:tc>
-        <w:tc>
-          <w:tcPr>
-            <w:tcW w:w="3118" w:type="dxa"/>
-            <w:tcBorders>
-              <w:top w:val="single" w:sz="4" w:space="0" w:color="000000"/>
-              <w:left w:val="single" w:sz="4" w:space="0" w:color="000000"/>
-              <w:bottom w:val="single" w:sz="4" w:space="0" w:color="000000"/>
-              <w:right w:val="single" w:sz="4" w:space="0" w:color="000000"/>
-            </w:tcBorders>
-            <w:hideMark/>
-          </w:tcPr>
-          <w:p>
-            <w:pPr>
-              <w:pStyle w:val="a9"/>
-              <w:rPr>
-                <w:sz w:val="16"/>
-                <w:szCs w:val="16"/>
-              </w:rPr>
-            </w:pPr>
-            <w:r>
-              <w:rPr>
-                <w:sz w:val="16"/>
-                <w:szCs w:val="16"/>
-              </w:rPr>
-              <w:t xml:space="preserve">Ответственный за погрузку </w:t>
-            </w:r>
-          </w:p>
-        </w:tc>
-        <w:tc>
-          <w:tcPr>
-            <w:tcW w:w="7088" w:type="dxa"/>
-            <w:tcBorders>
-              <w:top w:val="single" w:sz="4" w:space="0" w:color="000000"/>
-              <w:left w:val="single" w:sz="4" w:space="0" w:color="000000"/>
-              <w:bottom w:val="single" w:sz="4" w:space="0" w:color="000000"/>
-              <w:right w:val="single" w:sz="4" w:space="0" w:color="000000"/>
-            </w:tcBorders>
-            <w:hideMark/>
-          </w:tcPr>
-          <w:p>
-            <w:pPr>
-              <w:pStyle w:val="a9"/>
-              <w:rPr>
-                <w:sz w:val="16"/>
-                <w:szCs w:val="16"/>
-              </w:rPr>
-            </w:pPr>
-            <w:r>
-              <w:rPr>
-                <w:sz w:val="16"/>
-                <w:szCs w:val="16"/>
-                <w:lang w:val="en-US"/>
-              </w:rPr>
-              <w:t>${</w:t>
-            </w:r>
-            <w:proofErr w:type="spellStart"/>
-            <w:r>
-              <w:rPr>
-                <w:sz w:val="16"/>
-                <w:szCs w:val="16"/>
-                <w:lang w:val="en-US"/>
-              </w:rPr>
-              <w:t>kontakt_na_zagruzke</w:t>
-            </w:r>
-            <w:proofErr w:type="spellEnd"/>
-            <w:r>
-              <w:rPr>
-                <w:sz w:val="16"/>
-                <w:szCs w:val="16"/>
-                <w:lang w:val="en-US"/>
-              </w:rPr>
-              <w:t>}</w:t>
-            </w:r>
-          </w:p>
-        </w:tc>
-      </w:tr>
-      <w:tr>
-        <w:tc>
-          <w:tcPr>
-            <w:tcW w:w="421" w:type="dxa"/>
-            <w:tcBorders>
-              <w:top w:val="single" w:sz="4" w:space="0" w:color="000000"/>
-              <w:left w:val="single" w:sz="4" w:space="0" w:color="000000"/>
-              <w:bottom w:val="single" w:sz="4" w:space="0" w:color="000000"/>
-              <w:right w:val="single" w:sz="4" w:space="0" w:color="000000"/>
-            </w:tcBorders>
-            <w:vAlign w:val="center"/>
-            <w:hideMark/>
-          </w:tcPr>
-          <w:p>
-            <w:pPr>
-              <w:pStyle w:val="a9"/>
-              <w:rPr>
-                <w:sz w:val="16"/>
-                <w:szCs w:val="16"/>
-              </w:rPr>
-            </w:pPr>
-            <w:r>
-              <w:rPr>
-                <w:sz w:val="16"/>
-                <w:szCs w:val="16"/>
-              </w:rPr>
-              <w:t>11</w:t>
-            </w:r>
-          </w:p>
-        </w:tc>
-        <w:tc>
-          <w:tcPr>
-            <w:tcW w:w="3118" w:type="dxa"/>
-            <w:tcBorders>
-              <w:top w:val="single" w:sz="4" w:space="0" w:color="000000"/>
-              <w:left w:val="single" w:sz="4" w:space="0" w:color="000000"/>
-              <w:bottom w:val="single" w:sz="4" w:space="0" w:color="000000"/>
-              <w:right w:val="single" w:sz="4" w:space="0" w:color="000000"/>
-            </w:tcBorders>
-            <w:hideMark/>
-          </w:tcPr>
-          <w:p>
-            <w:pPr>
-              <w:pStyle w:val="a9"/>
-              <w:rPr>
-                <w:sz w:val="16"/>
-                <w:szCs w:val="16"/>
-              </w:rPr>
-            </w:pPr>
-            <w:r>
-              <w:rPr>
-                <w:sz w:val="16"/>
-                <w:szCs w:val="16"/>
-              </w:rPr>
-              <w:t>Особые условия для погрузки</w:t>
-            </w:r>
-          </w:p>
-        </w:tc>
-        <w:tc>
-          <w:tcPr>
-            <w:tcW w:w="7088" w:type="dxa"/>
-            <w:tcBorders>
-              <w:top w:val="single" w:sz="4" w:space="0" w:color="000000"/>
-              <w:left w:val="single" w:sz="4" w:space="0" w:color="000000"/>
-              <w:bottom w:val="single" w:sz="4" w:space="0" w:color="000000"/>
-              <w:right w:val="single" w:sz="4" w:space="0" w:color="000000"/>
-            </w:tcBorders>
-            <w:hideMark/>
-          </w:tcPr>
-          <w:p>
-            <w:pPr>
-              <w:pStyle w:val="a9"/>
-              <w:rPr>
-                <w:sz w:val="16"/>
-                <w:szCs w:val="16"/>
-              </w:rPr>
-            </w:pPr>
-            <w:r>
-              <w:rPr>
-                <w:sz w:val="16"/>
-                <w:szCs w:val="16"/>
-              </w:rPr>
-              <w:t>${</w:t>
-            </w:r>
-            <w:proofErr w:type="spellStart"/>
-            <w:r>
-              <w:rPr>
-                <w:sz w:val="16"/>
-                <w:szCs w:val="16"/>
-                <w:lang w:val="en-US"/>
-              </w:rPr>
-              <w:t>osobye_uslovia_pogruzki</w:t>
-            </w:r>
-            <w:proofErr w:type="spellEnd"/>
-            <w:r>
-              <w:rPr>
-                <w:sz w:val="16"/>
-                <w:szCs w:val="16"/>
+                <w:bCs/>
+                <w:sz w:val="16"/>
+                <w:szCs w:val="16"/>
+                <w:lang w:val="en-US"/>
               </w:rPr>
               <w:t>}</w:t>
             </w:r>
@@ -2828,7 +3323,7 @@
           <w:sz w:val="20"/>
           <w:szCs w:val="20"/>
         </w:rPr>
-        <w:t>РАЗГРУЗКА И ТАМОЖЕННОЕ ОФОРМЛЕНИЕ</w:t>
+        <w:t>ОСОБЫЕ УСЛОВИЯ</w:t>
       </w:r>
     </w:p>
     <w:tbl>
@@ -2869,14 +3364,7 @@
                 <w:sz w:val="16"/>
                 <w:szCs w:val="16"/>
               </w:rPr>
-              <w:t>1</w:t>
-            </w:r>
-            <w:r>
-              <w:rPr>
-                <w:sz w:val="16"/>
-                <w:szCs w:val="16"/>
-              </w:rPr>
-              <w:t>2</w:t>
+              <w:t>8</w:t>
             </w:r>
           </w:p>
         </w:tc>
@@ -2904,328 +3392,14 @@
                 <w:sz w:val="16"/>
                 <w:szCs w:val="16"/>
               </w:rPr>
-              <w:t>Грузополучатель</w:t>
-            </w:r>
-          </w:p>
-        </w:tc>
-        <w:tc>
-          <w:tcPr>
-            <w:tcW w:w="7088" w:type="dxa"/>
-            <w:tcBorders>
-              <w:top w:val="single" w:sz="4" w:space="0" w:color="000000"/>
-              <w:left w:val="single" w:sz="4" w:space="0" w:color="000000"/>
-              <w:bottom w:val="single" w:sz="4" w:space="0" w:color="000000"/>
-              <w:right w:val="single" w:sz="4" w:space="0" w:color="000000"/>
-            </w:tcBorders>
-            <w:hideMark/>
-          </w:tcPr>
-          <w:p>
-            <w:pPr>
-              <w:pStyle w:val="a9"/>
-              <w:rPr>
-                <w:bCs/>
-                <w:sz w:val="16"/>
-                <w:szCs w:val="16"/>
-              </w:rPr>
-            </w:pPr>
-            <w:r>
-              <w:rPr>
-                <w:sz w:val="16"/>
-                <w:szCs w:val="16"/>
-                <w:lang w:val="en-US"/>
-              </w:rPr>
-              <w:t>${</w:t>
-            </w:r>
-            <w:proofErr w:type="spellStart"/>
-            <w:r>
-              <w:rPr>
-                <w:sz w:val="16"/>
-                <w:szCs w:val="16"/>
-                <w:lang w:val="en-US"/>
-              </w:rPr>
-              <w:t>gruzopoluchatel</w:t>
-            </w:r>
-            <w:proofErr w:type="spellEnd"/>
-            <w:r>
-              <w:rPr>
-                <w:sz w:val="16"/>
-                <w:szCs w:val="16"/>
-                <w:lang w:val="en-US"/>
-              </w:rPr>
-              <w:t>}</w:t>
-            </w:r>
-          </w:p>
-        </w:tc>
-      </w:tr>
-      <w:tr>
-        <w:tc>
-          <w:tcPr>
-            <w:tcW w:w="418" w:type="dxa"/>
-            <w:tcBorders>
-              <w:top w:val="single" w:sz="4" w:space="0" w:color="000000"/>
-              <w:left w:val="single" w:sz="4" w:space="0" w:color="000000"/>
-              <w:bottom w:val="single" w:sz="4" w:space="0" w:color="000000"/>
-              <w:right w:val="single" w:sz="4" w:space="0" w:color="000000"/>
-            </w:tcBorders>
-            <w:vAlign w:val="center"/>
-            <w:hideMark/>
-          </w:tcPr>
-          <w:p>
-            <w:pPr>
-              <w:pStyle w:val="a9"/>
-              <w:rPr>
-                <w:sz w:val="16"/>
-                <w:szCs w:val="16"/>
-              </w:rPr>
-            </w:pPr>
-            <w:r>
-              <w:rPr>
-                <w:sz w:val="16"/>
-                <w:szCs w:val="16"/>
-              </w:rPr>
-              <w:t>13</w:t>
-            </w:r>
-          </w:p>
-        </w:tc>
-        <w:tc>
-          <w:tcPr>
-            <w:tcW w:w="3121" w:type="dxa"/>
-            <w:tcBorders>
-              <w:top w:val="single" w:sz="4" w:space="0" w:color="000000"/>
-              <w:left w:val="single" w:sz="4" w:space="0" w:color="000000"/>
-              <w:bottom w:val="single" w:sz="4" w:space="0" w:color="000000"/>
-              <w:right w:val="single" w:sz="4" w:space="0" w:color="000000"/>
-            </w:tcBorders>
-            <w:hideMark/>
-          </w:tcPr>
-          <w:p>
-            <w:pPr>
-              <w:pStyle w:val="a9"/>
-              <w:rPr>
-                <w:sz w:val="16"/>
-                <w:szCs w:val="16"/>
-              </w:rPr>
-            </w:pPr>
-            <w:r>
-              <w:rPr>
-                <w:sz w:val="16"/>
-                <w:szCs w:val="16"/>
-              </w:rPr>
-              <w:t xml:space="preserve">Ответственный за разгрузку </w:t>
-            </w:r>
-          </w:p>
-        </w:tc>
-        <w:tc>
-          <w:tcPr>
-            <w:tcW w:w="7088" w:type="dxa"/>
-            <w:tcBorders>
-              <w:top w:val="single" w:sz="4" w:space="0" w:color="000000"/>
-              <w:left w:val="single" w:sz="4" w:space="0" w:color="000000"/>
-              <w:bottom w:val="single" w:sz="4" w:space="0" w:color="000000"/>
-              <w:right w:val="single" w:sz="4" w:space="0" w:color="000000"/>
-            </w:tcBorders>
-            <w:hideMark/>
-          </w:tcPr>
-          <w:p>
-            <w:pPr>
-              <w:pStyle w:val="a9"/>
-              <w:rPr>
-                <w:bCs/>
-                <w:sz w:val="16"/>
-                <w:szCs w:val="16"/>
-              </w:rPr>
-            </w:pPr>
-            <w:r>
-              <w:rPr>
-                <w:sz w:val="16"/>
-                <w:szCs w:val="16"/>
-                <w:lang w:val="en-US"/>
-              </w:rPr>
-              <w:t>${</w:t>
-            </w:r>
-            <w:proofErr w:type="spellStart"/>
-            <w:r>
-              <w:rPr>
-                <w:sz w:val="16"/>
-                <w:szCs w:val="16"/>
-                <w:lang w:val="en-US"/>
-              </w:rPr>
-              <w:t>kontakt_na_vygruzke</w:t>
-            </w:r>
-            <w:proofErr w:type="spellEnd"/>
-            <w:r>
-              <w:rPr>
-                <w:sz w:val="16"/>
-                <w:szCs w:val="16"/>
-                <w:lang w:val="en-US"/>
-              </w:rPr>
-              <w:t>}</w:t>
-            </w:r>
-          </w:p>
-        </w:tc>
-      </w:tr>
-      <w:tr>
-        <w:tc>
-          <w:tcPr>
-            <w:tcW w:w="418" w:type="dxa"/>
-            <w:tcBorders>
-              <w:top w:val="single" w:sz="4" w:space="0" w:color="000000"/>
-              <w:left w:val="single" w:sz="4" w:space="0" w:color="000000"/>
-              <w:bottom w:val="single" w:sz="4" w:space="0" w:color="000000"/>
-              <w:right w:val="single" w:sz="4" w:space="0" w:color="000000"/>
-            </w:tcBorders>
-            <w:vAlign w:val="center"/>
-            <w:hideMark/>
-          </w:tcPr>
-          <w:p>
-            <w:pPr>
-              <w:pStyle w:val="a9"/>
-              <w:rPr>
-                <w:sz w:val="16"/>
-                <w:szCs w:val="16"/>
-              </w:rPr>
-            </w:pPr>
-            <w:r>
-              <w:rPr>
-                <w:sz w:val="16"/>
-                <w:szCs w:val="16"/>
-              </w:rPr>
-              <w:t>14</w:t>
-            </w:r>
-          </w:p>
-        </w:tc>
-        <w:tc>
-          <w:tcPr>
-            <w:tcW w:w="3121" w:type="dxa"/>
-            <w:tcBorders>
-              <w:top w:val="single" w:sz="4" w:space="0" w:color="000000"/>
-              <w:left w:val="single" w:sz="4" w:space="0" w:color="000000"/>
-              <w:bottom w:val="single" w:sz="4" w:space="0" w:color="000000"/>
-              <w:right w:val="single" w:sz="4" w:space="0" w:color="000000"/>
-            </w:tcBorders>
-            <w:hideMark/>
-          </w:tcPr>
-          <w:p>
-            <w:pPr>
-              <w:pStyle w:val="a9"/>
-              <w:rPr>
-                <w:sz w:val="16"/>
-                <w:szCs w:val="16"/>
-              </w:rPr>
-            </w:pPr>
-            <w:r>
-              <w:rPr>
-                <w:sz w:val="16"/>
-                <w:szCs w:val="16"/>
-              </w:rPr>
-              <w:t>Адрес места разгрузки</w:t>
-            </w:r>
-          </w:p>
-        </w:tc>
-        <w:tc>
-          <w:tcPr>
-            <w:tcW w:w="7088" w:type="dxa"/>
-            <w:tcBorders>
-              <w:top w:val="single" w:sz="4" w:space="0" w:color="000000"/>
-              <w:left w:val="single" w:sz="4" w:space="0" w:color="000000"/>
-              <w:bottom w:val="single" w:sz="4" w:space="0" w:color="000000"/>
-              <w:right w:val="single" w:sz="4" w:space="0" w:color="000000"/>
-            </w:tcBorders>
-            <w:hideMark/>
-          </w:tcPr>
-          <w:p>
-            <w:pPr>
-              <w:pStyle w:val="a9"/>
-              <w:rPr>
-                <w:bCs/>
-                <w:sz w:val="16"/>
-                <w:szCs w:val="16"/>
-              </w:rPr>
-            </w:pPr>
-            <w:r>
-              <w:rPr>
-                <w:sz w:val="16"/>
-                <w:szCs w:val="16"/>
-                <w:lang w:val="en-US"/>
-              </w:rPr>
-              <w:t>${</w:t>
-            </w:r>
-            <w:proofErr w:type="spellStart"/>
-            <w:r>
-              <w:rPr>
-                <w:sz w:val="16"/>
-                <w:szCs w:val="16"/>
-                <w:lang w:val="en-US"/>
-              </w:rPr>
-              <w:t>address_vygruzki</w:t>
-            </w:r>
-            <w:proofErr w:type="spellEnd"/>
-            <w:r>
-              <w:rPr>
-                <w:sz w:val="16"/>
-                <w:szCs w:val="16"/>
-                <w:lang w:val="en-US"/>
-              </w:rPr>
-              <w:t>}</w:t>
-            </w:r>
-          </w:p>
-        </w:tc>
-      </w:tr>
-      <w:tr>
-        <w:tc>
-          <w:tcPr>
-            <w:tcW w:w="418" w:type="dxa"/>
-            <w:tcBorders>
-              <w:top w:val="single" w:sz="4" w:space="0" w:color="000000"/>
-              <w:left w:val="single" w:sz="4" w:space="0" w:color="000000"/>
-              <w:bottom w:val="single" w:sz="4" w:space="0" w:color="000000"/>
-              <w:right w:val="single" w:sz="4" w:space="0" w:color="000000"/>
-            </w:tcBorders>
-            <w:vAlign w:val="center"/>
-            <w:hideMark/>
-          </w:tcPr>
-          <w:p>
-            <w:pPr>
-              <w:pStyle w:val="a9"/>
-              <w:rPr>
-                <w:sz w:val="16"/>
-                <w:szCs w:val="16"/>
-              </w:rPr>
-            </w:pPr>
-            <w:r>
-              <w:rPr>
-                <w:sz w:val="16"/>
-                <w:szCs w:val="16"/>
-              </w:rPr>
-              <w:t>15</w:t>
-            </w:r>
-          </w:p>
-        </w:tc>
-        <w:tc>
-          <w:tcPr>
-            <w:tcW w:w="3121" w:type="dxa"/>
-            <w:tcBorders>
-              <w:top w:val="single" w:sz="4" w:space="0" w:color="000000"/>
-              <w:left w:val="single" w:sz="4" w:space="0" w:color="000000"/>
-              <w:bottom w:val="single" w:sz="4" w:space="0" w:color="000000"/>
-              <w:right w:val="single" w:sz="4" w:space="0" w:color="000000"/>
-            </w:tcBorders>
-            <w:hideMark/>
-          </w:tcPr>
-          <w:p>
-            <w:pPr>
-              <w:pStyle w:val="a9"/>
-              <w:rPr>
-                <w:sz w:val="16"/>
-                <w:szCs w:val="16"/>
-              </w:rPr>
-            </w:pPr>
-            <w:r>
-              <w:rPr>
-                <w:sz w:val="16"/>
-                <w:szCs w:val="16"/>
-              </w:rPr>
-              <w:t>Особые условия по разгрузке</w:t>
+              <w:t xml:space="preserve">Особые условия </w:t>
+            </w:r>
+            <w:r>
+              <w:rPr>
+                <w:sz w:val="16"/>
+                <w:szCs w:val="16"/>
+              </w:rPr>
+              <w:t>погрузки / выгрузки</w:t>
             </w:r>
           </w:p>
         </w:tc>
@@ -3277,6 +3451,17 @@
         </w:tc>
       </w:tr>
     </w:tbl>
+    <w:p>
+      <w:pPr>
+        <w:pStyle w:val="a9"/>
+        <w:rPr>
+          <w:b/>
+          <w:sz w:val="20"/>
+          <w:szCs w:val="20"/>
+          <w:lang w:val="en-US"/>
+        </w:rPr>
+      </w:pPr>
+    </w:p>
     <w:p>
       <w:pPr>
         <w:pStyle w:val="a9"/>
@@ -3306,9 +3491,12 @@
         <w:gridCol w:w="421"/>
         <w:gridCol w:w="1134"/>
         <w:gridCol w:w="1984"/>
-        <w:gridCol w:w="2362"/>
-        <w:gridCol w:w="2363"/>
-        <w:gridCol w:w="2363"/>
+        <w:gridCol w:w="1772"/>
+        <w:gridCol w:w="590"/>
+        <w:gridCol w:w="1182"/>
+        <w:gridCol w:w="1181"/>
+        <w:gridCol w:w="591"/>
+        <w:gridCol w:w="1772"/>
       </w:tblGrid>
       <w:tr>
         <w:tc>
@@ -3336,14 +3524,7 @@
                 <w:sz w:val="16"/>
                 <w:szCs w:val="16"/>
               </w:rPr>
-              <w:t>1</w:t>
-            </w:r>
-            <w:r>
-              <w:rPr>
-                <w:sz w:val="16"/>
-                <w:szCs w:val="16"/>
-              </w:rPr>
-              <w:t>6</w:t>
+              <w:t>9</w:t>
             </w:r>
           </w:p>
         </w:tc>
@@ -3379,6 +3560,7 @@
         <w:tc>
           <w:tcPr>
             <w:tcW w:w="2362" w:type="dxa"/>
+            <w:gridSpan w:val="2"/>
             <w:tcBorders>
               <w:top w:val="single" w:sz="4" w:space="0" w:color="000000"/>
               <w:left w:val="single" w:sz="4" w:space="0" w:color="000000"/>
@@ -3426,6 +3608,7 @@
         <w:tc>
           <w:tcPr>
             <w:tcW w:w="2363" w:type="dxa"/>
+            <w:gridSpan w:val="2"/>
             <w:tcBorders>
               <w:top w:val="single" w:sz="4" w:space="0" w:color="000000"/>
               <w:left w:val="single" w:sz="4" w:space="0" w:color="000000"/>
@@ -3453,6 +3636,7 @@
         <w:tc>
           <w:tcPr>
             <w:tcW w:w="2363" w:type="dxa"/>
+            <w:gridSpan w:val="2"/>
             <w:tcBorders>
               <w:top w:val="single" w:sz="4" w:space="0" w:color="000000"/>
               <w:left w:val="single" w:sz="4" w:space="0" w:color="000000"/>
@@ -3523,7 +3707,14 @@
                 <w:sz w:val="16"/>
                 <w:szCs w:val="16"/>
               </w:rPr>
-              <w:t>17</w:t>
+              <w:t>1</w:t>
+            </w:r>
+            <w:r>
+              <w:rPr>
+                <w:sz w:val="16"/>
+                <w:szCs w:val="16"/>
+              </w:rPr>
+              <w:t>0</w:t>
             </w:r>
           </w:p>
         </w:tc>
@@ -3559,7 +3750,7 @@
         <w:tc>
           <w:tcPr>
             <w:tcW w:w="7088" w:type="dxa"/>
-            <w:gridSpan w:val="3"/>
+            <w:gridSpan w:val="6"/>
             <w:tcBorders>
               <w:top w:val="single" w:sz="4" w:space="0" w:color="000000"/>
               <w:left w:val="single" w:sz="4" w:space="0" w:color="000000"/>
@@ -3628,7 +3819,14 @@
                 <w:sz w:val="16"/>
                 <w:szCs w:val="16"/>
               </w:rPr>
-              <w:t>18</w:t>
+              <w:t>1</w:t>
+            </w:r>
+            <w:r>
+              <w:rPr>
+                <w:sz w:val="16"/>
+                <w:szCs w:val="16"/>
+              </w:rPr>
+              <w:t>1</w:t>
             </w:r>
           </w:p>
         </w:tc>
@@ -3664,7 +3862,7 @@
         <w:tc>
           <w:tcPr>
             <w:tcW w:w="7088" w:type="dxa"/>
-            <w:gridSpan w:val="3"/>
+            <w:gridSpan w:val="6"/>
             <w:tcBorders>
               <w:top w:val="single" w:sz="4" w:space="0" w:color="000000"/>
               <w:left w:val="single" w:sz="4" w:space="0" w:color="000000"/>
@@ -3779,7 +3977,14 @@
                 <w:sz w:val="16"/>
                 <w:szCs w:val="16"/>
               </w:rPr>
-              <w:t>19</w:t>
+              <w:t>1</w:t>
+            </w:r>
+            <w:r>
+              <w:rPr>
+                <w:sz w:val="16"/>
+                <w:szCs w:val="16"/>
+              </w:rPr>
+              <w:t>2</w:t>
             </w:r>
           </w:p>
         </w:tc>
@@ -3815,7 +4020,7 @@
         <w:tc>
           <w:tcPr>
             <w:tcW w:w="7088" w:type="dxa"/>
-            <w:gridSpan w:val="3"/>
+            <w:gridSpan w:val="6"/>
             <w:tcBorders>
               <w:top w:val="single" w:sz="4" w:space="0" w:color="000000"/>
               <w:left w:val="single" w:sz="4" w:space="0" w:color="000000"/>
@@ -3918,7 +4123,7 @@
                 <w:sz w:val="16"/>
                 <w:szCs w:val="16"/>
               </w:rPr>
-              <w:t>20</w:t>
+              <w:t>13</w:t>
             </w:r>
           </w:p>
         </w:tc>
@@ -3953,14 +4158,13 @@
         </w:tc>
         <w:tc>
           <w:tcPr>
-            <w:tcW w:w="2362" w:type="dxa"/>
-            <w:tcBorders>
-              <w:top w:val="single" w:sz="4" w:space="0" w:color="000000"/>
-              <w:left w:val="single" w:sz="4" w:space="0" w:color="000000"/>
-              <w:bottom w:val="single" w:sz="4" w:space="0" w:color="000000"/>
-              <w:right w:val="single" w:sz="4" w:space="0" w:color="000000"/>
-            </w:tcBorders>
-            <w:hideMark/>
+            <w:tcW w:w="1772" w:type="dxa"/>
+            <w:tcBorders>
+              <w:top w:val="single" w:sz="4" w:space="0" w:color="000000"/>
+              <w:left w:val="single" w:sz="4" w:space="0" w:color="000000"/>
+              <w:bottom w:val="single" w:sz="4" w:space="0" w:color="000000"/>
+              <w:right w:val="single" w:sz="4" w:space="0" w:color="000000"/>
+            </w:tcBorders>
           </w:tcPr>
           <w:p>
             <w:pPr>
@@ -4001,34 +4205,8 @@
         </w:tc>
         <w:tc>
           <w:tcPr>
-            <w:tcW w:w="2363" w:type="dxa"/>
-            <w:tcBorders>
-              <w:top w:val="single" w:sz="4" w:space="0" w:color="000000"/>
-              <w:left w:val="single" w:sz="4" w:space="0" w:color="000000"/>
-              <w:bottom w:val="single" w:sz="4" w:space="0" w:color="000000"/>
-              <w:right w:val="single" w:sz="4" w:space="0" w:color="000000"/>
-            </w:tcBorders>
-          </w:tcPr>
-          <w:p>
-            <w:pPr>
-              <w:pStyle w:val="a9"/>
-              <w:rPr>
-                <w:sz w:val="16"/>
-                <w:szCs w:val="16"/>
-              </w:rPr>
-            </w:pPr>
-            <w:r>
-              <w:rPr>
-                <w:sz w:val="16"/>
-                <w:szCs w:val="16"/>
-              </w:rPr>
-              <w:t>Номер</w:t>
-            </w:r>
-          </w:p>
-        </w:tc>
-        <w:tc>
-          <w:tcPr>
-            <w:tcW w:w="2363" w:type="dxa"/>
+            <w:tcW w:w="1772" w:type="dxa"/>
+            <w:gridSpan w:val="2"/>
             <w:tcBorders>
               <w:top w:val="single" w:sz="4" w:space="0" w:color="000000"/>
               <w:left w:val="single" w:sz="4" w:space="0" w:color="000000"/>
@@ -4061,6 +4239,125 @@
                 <w:lang w:val="en-US"/>
               </w:rPr>
               <w:t>gosnomer</w:t>
+            </w:r>
+            <w:r>
+              <w:rPr>
+                <w:sz w:val="16"/>
+                <w:szCs w:val="16"/>
+                <w:lang w:val="en-US"/>
+              </w:rPr>
+              <w:t>_TS</w:t>
+            </w:r>
+            <w:proofErr w:type="spellEnd"/>
+            <w:r>
+              <w:rPr>
+                <w:sz w:val="16"/>
+                <w:szCs w:val="16"/>
+                <w:lang w:val="en-US"/>
+              </w:rPr>
+              <w:t>}</w:t>
+            </w:r>
+          </w:p>
+        </w:tc>
+        <w:tc>
+          <w:tcPr>
+            <w:tcW w:w="1772" w:type="dxa"/>
+            <w:gridSpan w:val="2"/>
+            <w:tcBorders>
+              <w:top w:val="single" w:sz="4" w:space="0" w:color="000000"/>
+              <w:left w:val="single" w:sz="4" w:space="0" w:color="000000"/>
+              <w:bottom w:val="single" w:sz="4" w:space="0" w:color="000000"/>
+              <w:right w:val="single" w:sz="4" w:space="0" w:color="000000"/>
+            </w:tcBorders>
+          </w:tcPr>
+          <w:p>
+            <w:pPr>
+              <w:pStyle w:val="a9"/>
+              <w:rPr>
+                <w:sz w:val="16"/>
+                <w:szCs w:val="16"/>
+                <w:u w:val="single"/>
+              </w:rPr>
+            </w:pPr>
+            <w:r>
+              <w:rPr>
+                <w:sz w:val="16"/>
+                <w:szCs w:val="16"/>
+                <w:lang w:val="en-US"/>
+              </w:rPr>
+              <w:t>${</w:t>
+            </w:r>
+            <w:proofErr w:type="spellStart"/>
+            <w:r>
+              <w:rPr>
+                <w:sz w:val="16"/>
+                <w:szCs w:val="16"/>
+                <w:lang w:val="en-US"/>
+              </w:rPr>
+              <w:t>marka_</w:t>
+            </w:r>
+            <w:r>
+              <w:rPr>
+                <w:sz w:val="16"/>
+                <w:szCs w:val="16"/>
+                <w:lang w:val="en-US"/>
+              </w:rPr>
+              <w:t>priz</w:t>
+            </w:r>
+            <w:proofErr w:type="spellEnd"/>
+            <w:r>
+              <w:rPr>
+                <w:sz w:val="16"/>
+                <w:szCs w:val="16"/>
+                <w:lang w:val="en-US"/>
+              </w:rPr>
+              <w:t>}</w:t>
+            </w:r>
+          </w:p>
+        </w:tc>
+        <w:tc>
+          <w:tcPr>
+            <w:tcW w:w="1772" w:type="dxa"/>
+            <w:tcBorders>
+              <w:top w:val="single" w:sz="4" w:space="0" w:color="000000"/>
+              <w:left w:val="single" w:sz="4" w:space="0" w:color="000000"/>
+              <w:bottom w:val="single" w:sz="4" w:space="0" w:color="000000"/>
+              <w:right w:val="single" w:sz="4" w:space="0" w:color="000000"/>
+            </w:tcBorders>
+          </w:tcPr>
+          <w:p>
+            <w:pPr>
+              <w:pStyle w:val="a9"/>
+              <w:rPr>
+                <w:sz w:val="16"/>
+                <w:szCs w:val="16"/>
+                <w:u w:val="single"/>
+              </w:rPr>
+            </w:pPr>
+            <w:r>
+              <w:rPr>
+                <w:sz w:val="16"/>
+                <w:szCs w:val="16"/>
+                <w:lang w:val="en-US"/>
+              </w:rPr>
+              <w:t>${</w:t>
+            </w:r>
+            <w:proofErr w:type="spellStart"/>
+            <w:r>
+              <w:rPr>
+                <w:sz w:val="16"/>
+                <w:szCs w:val="16"/>
+                <w:lang w:val="en-US"/>
+              </w:rPr>
+              <w:t>gosnomer</w:t>
+            </w:r>
+            <w:r>
+              <w:rPr>
+                <w:sz w:val="16"/>
+                <w:szCs w:val="16"/>
+                <w:lang w:val="en-US"/>
+              </w:rPr>
+              <w:t>_priz</w:t>
             </w:r>
             <w:proofErr w:type="spellEnd"/>
             <w:r>
@@ -4104,7 +4401,7 @@
                 <w:sz w:val="16"/>
                 <w:szCs w:val="16"/>
               </w:rPr>
-              <w:t>21</w:t>
+              <w:t>14</w:t>
             </w:r>
           </w:p>
         </w:tc>
@@ -4170,7 +4467,7 @@
         <w:tc>
           <w:tcPr>
             <w:tcW w:w="7088" w:type="dxa"/>
-            <w:gridSpan w:val="3"/>
+            <w:gridSpan w:val="6"/>
             <w:tcBorders>
               <w:top w:val="single" w:sz="4" w:space="0" w:color="000000"/>
               <w:left w:val="single" w:sz="4" w:space="0" w:color="000000"/>
@@ -4310,7 +4607,7 @@
         <w:tc>
           <w:tcPr>
             <w:tcW w:w="7088" w:type="dxa"/>
-            <w:gridSpan w:val="3"/>
+            <w:gridSpan w:val="6"/>
             <w:tcBorders>
               <w:top w:val="single" w:sz="4" w:space="0" w:color="000000"/>
               <w:left w:val="single" w:sz="4" w:space="0" w:color="000000"/>
@@ -4447,7 +4744,7 @@
         <w:tc>
           <w:tcPr>
             <w:tcW w:w="7088" w:type="dxa"/>
-            <w:gridSpan w:val="3"/>
+            <w:gridSpan w:val="6"/>
             <w:tcBorders>
               <w:top w:val="single" w:sz="4" w:space="0" w:color="000000"/>
               <w:left w:val="single" w:sz="4" w:space="0" w:color="000000"/>
@@ -4876,7 +5173,6 @@
               <w:rPr>
                 <w:sz w:val="16"/>
                 <w:szCs w:val="16"/>
-                <w:lang w:val="en-US"/>
               </w:rPr>
             </w:pPr>
             <w:r>
@@ -4890,7 +5186,6 @@
               <w:rPr>
                 <w:sz w:val="16"/>
                 <w:szCs w:val="16"/>
-                <w:lang w:val="en-US"/>
               </w:rPr>
               <w:t xml:space="preserve">. </w:t>
             </w:r>
@@ -4905,10 +5200,24 @@
               <w:rPr>
                 <w:sz w:val="16"/>
                 <w:szCs w:val="16"/>
-                <w:lang w:val="en-US"/>
               </w:rPr>
               <w:t>: ${</w:t>
             </w:r>
+            <w:r>
+              <w:rPr>
+                <w:sz w:val="16"/>
+                <w:szCs w:val="16"/>
+                <w:lang w:val="en-US"/>
+              </w:rPr>
+              <w:t>cp</w:t>
+            </w:r>
+            <w:r>
+              <w:rPr>
+                <w:sz w:val="16"/>
+                <w:szCs w:val="16"/>
+              </w:rPr>
+              <w:t>_</w:t>
+            </w:r>
             <w:proofErr w:type="spellStart"/>
             <w:r>
               <w:rPr>
@@ -4916,22 +5225,28 @@
                 <w:szCs w:val="16"/>
                 <w:lang w:val="en-US"/>
               </w:rPr>
-              <w:t>cp</w:t>
-            </w:r>
-            <w:r>
-              <w:rPr>
-                <w:sz w:val="16"/>
-                <w:szCs w:val="16"/>
-                <w:lang w:val="en-US"/>
-              </w:rPr>
-              <w:t>_pocht_address</w:t>
+              <w:t>pocht</w:t>
             </w:r>
             <w:proofErr w:type="spellEnd"/>
             <w:r>
               <w:rPr>
                 <w:sz w:val="16"/>
                 <w:szCs w:val="16"/>
-                <w:lang w:val="en-US"/>
+              </w:rPr>
+              <w:t>_</w:t>
+            </w:r>
+            <w:r>
+              <w:rPr>
+                <w:sz w:val="16"/>
+                <w:szCs w:val="16"/>
+                <w:lang w:val="en-US"/>
+              </w:rPr>
+              <w:t>address</w:t>
+            </w:r>
+            <w:r>
+              <w:rPr>
+                <w:sz w:val="16"/>
+                <w:szCs w:val="16"/>
               </w:rPr>
               <w:t>}</w:t>
             </w:r>
@@ -4954,7 +5269,6 @@
               <w:rPr>
                 <w:sz w:val="16"/>
                 <w:szCs w:val="16"/>
-                <w:lang w:val="en-US"/>
               </w:rPr>
             </w:pPr>
             <w:r>
@@ -4968,7 +5282,6 @@
               <w:rPr>
                 <w:sz w:val="16"/>
                 <w:szCs w:val="16"/>
-                <w:lang w:val="en-US"/>
               </w:rPr>
               <w:t xml:space="preserve">. </w:t>
             </w:r>
@@ -4983,7 +5296,6 @@
               <w:rPr>
                 <w:sz w:val="16"/>
                 <w:szCs w:val="16"/>
-                <w:lang w:val="en-US"/>
               </w:rPr>
               <w:t>: ${</w:t>
             </w:r>
@@ -4994,14 +5306,45 @@
                 <w:szCs w:val="16"/>
                 <w:lang w:val="en-US"/>
               </w:rPr>
-              <w:t>lp_pocht_address</w:t>
+              <w:t>lp</w:t>
             </w:r>
             <w:proofErr w:type="spellEnd"/>
             <w:r>
               <w:rPr>
                 <w:sz w:val="16"/>
                 <w:szCs w:val="16"/>
-                <w:lang w:val="en-US"/>
+              </w:rPr>
+              <w:t>_</w:t>
+            </w:r>
+            <w:proofErr w:type="spellStart"/>
+            <w:r>
+              <w:rPr>
+                <w:sz w:val="16"/>
+                <w:szCs w:val="16"/>
+                <w:lang w:val="en-US"/>
+              </w:rPr>
+              <w:t>pocht</w:t>
+            </w:r>
+            <w:proofErr w:type="spellEnd"/>
+            <w:r>
+              <w:rPr>
+                <w:sz w:val="16"/>
+                <w:szCs w:val="16"/>
+              </w:rPr>
+              <w:t>_</w:t>
+            </w:r>
+            <w:r>
+              <w:rPr>
+                <w:sz w:val="16"/>
+                <w:szCs w:val="16"/>
+                <w:lang w:val="en-US"/>
+              </w:rPr>
+              <w:t>address</w:t>
+            </w:r>
+            <w:r>
+              <w:rPr>
+                <w:sz w:val="16"/>
+                <w:szCs w:val="16"/>
               </w:rPr>
               <w:t>}</w:t>
             </w:r>
@@ -5353,7 +5696,15 @@
                 <w:szCs w:val="16"/>
                 <w:lang w:val="en-US"/>
               </w:rPr>
-              <w:t>dp_</w:t>
+              <w:t>l</w:t>
+            </w:r>
+            <w:r>
+              <w:rPr>
+                <w:sz w:val="16"/>
+                <w:szCs w:val="16"/>
+                <w:lang w:val="en-US"/>
+              </w:rPr>
+              <w:t>p_</w:t>
             </w:r>
             <w:r>
               <w:rPr>
@@ -6356,7 +6707,7 @@
                 <w:szCs w:val="16"/>
                 <w:lang w:val="en-US"/>
               </w:rPr>
-              <w:t>______________________</w:t>
+              <w:t>__________________</w:t>
             </w:r>
             <w:r>
               <w:rPr>
@@ -6540,16 +6891,138 @@
                 <w:szCs w:val="16"/>
                 <w:lang w:val="en-US"/>
               </w:rPr>
-              <w:t xml:space="preserve">}   </w:t>
+              <w:t>}</w:t>
+            </w:r>
+            <w:r>
+              <w:rPr>
+                <w:sz w:val="16"/>
+                <w:szCs w:val="16"/>
+                <w:lang w:val="en-US"/>
+              </w:rPr>
+              <w:t>_</w:t>
             </w:r>
             <w:proofErr w:type="gramEnd"/>
             <w:r>
               <w:rPr>
                 <w:sz w:val="16"/>
                 <w:szCs w:val="16"/>
+                <w:lang w:val="en-US"/>
+              </w:rPr>
+              <w:t>____________________</w:t>
+            </w:r>
+            <w:r>
+              <w:rPr>
+                <w:sz w:val="16"/>
+                <w:szCs w:val="16"/>
                 <w:u w:val="single"/>
                 <w:lang w:val="en-US"/>
               </w:rPr>
+              <w:t>${signature}</w:t>
+            </w:r>
+            <w:r>
+              <w:rPr>
+                <w:sz w:val="16"/>
+                <w:szCs w:val="16"/>
+                <w:lang w:val="en-US"/>
+              </w:rPr>
+              <w:t xml:space="preserve">       /${</w:t>
+            </w:r>
+            <w:proofErr w:type="spellStart"/>
+            <w:r>
+              <w:rPr>
+                <w:sz w:val="16"/>
+                <w:szCs w:val="16"/>
+                <w:u w:val="single"/>
+                <w:lang w:val="en-US"/>
+              </w:rPr>
+              <w:t>lp_ceo</w:t>
+            </w:r>
+            <w:proofErr w:type="spellEnd"/>
+            <w:r>
+              <w:rPr>
+                <w:sz w:val="16"/>
+                <w:szCs w:val="16"/>
+                <w:lang w:val="en-US"/>
+              </w:rPr>
+              <w:t>}/</w:t>
+            </w:r>
+          </w:p>
+          <w:p>
+            <w:pPr>
+              <w:rPr>
+                <w:sz w:val="16"/>
+                <w:szCs w:val="16"/>
+                <w:lang w:val="en-US"/>
+              </w:rPr>
+            </w:pPr>
+            <w:r>
+              <w:rPr>
+                <w:i/>
+                <w:sz w:val="16"/>
+                <w:szCs w:val="16"/>
+                <w:lang w:val="en-US"/>
+              </w:rPr>
+              <w:t xml:space="preserve">                                 </w:t>
+            </w:r>
+            <w:r>
+              <w:rPr>
+                <w:i/>
+                <w:sz w:val="16"/>
+                <w:szCs w:val="16"/>
+              </w:rPr>
+              <w:t>подпись</w:t>
+            </w:r>
+            <w:r>
+              <w:rPr>
+                <w:sz w:val="16"/>
+                <w:szCs w:val="16"/>
+                <w:lang w:val="en-US"/>
+              </w:rPr>
+              <w:t xml:space="preserve">                              </w:t>
+            </w:r>
+            <w:r>
+              <w:rPr>
+                <w:sz w:val="16"/>
+                <w:szCs w:val="16"/>
+              </w:rPr>
+              <w:t>М</w:t>
+            </w:r>
+            <w:r>
+              <w:rPr>
+                <w:sz w:val="16"/>
+                <w:szCs w:val="16"/>
+                <w:lang w:val="en-US"/>
+              </w:rPr>
+              <w:t>.</w:t>
+            </w:r>
+            <w:r>
+              <w:rPr>
+                <w:sz w:val="16"/>
+                <w:szCs w:val="16"/>
+              </w:rPr>
+              <w:t>П</w:t>
+            </w:r>
+            <w:r>
+              <w:rPr>
+                <w:sz w:val="16"/>
+                <w:szCs w:val="16"/>
+                <w:lang w:val="en-US"/>
+              </w:rPr>
+              <w:t>.</w:t>
+            </w:r>
+            <w:r>
+              <w:rPr>
+                <w:sz w:val="16"/>
+                <w:szCs w:val="16"/>
+                <w:lang w:val="en-US"/>
+              </w:rPr>
+              <w:t xml:space="preserve"> </w:t>
+            </w:r>
+            <w:r>
+              <w:rPr>
+                <w:sz w:val="16"/>
+                <w:szCs w:val="16"/>
+              </w:rPr>
               <w:t>${</w:t>
             </w:r>
             <w:proofErr w:type="spellStart"/>
@@ -6557,143 +7030,14 @@
               <w:rPr>
                 <w:sz w:val="16"/>
                 <w:szCs w:val="16"/>
-                <w:u w:val="single"/>
-                <w:lang w:val="en-US"/>
-              </w:rPr>
-              <w:t>internal_signature_image</w:t>
+              </w:rPr>
+              <w:t>stamp</w:t>
             </w:r>
             <w:proofErr w:type="spellEnd"/>
             <w:r>
               <w:rPr>
                 <w:sz w:val="16"/>
                 <w:szCs w:val="16"/>
-                <w:u w:val="single"/>
-                <w:lang w:val="en-US"/>
-              </w:rPr>
-              <w:t>}</w:t>
-            </w:r>
-            <w:r>
-              <w:rPr>
-                <w:sz w:val="16"/>
-                <w:szCs w:val="16"/>
-                <w:lang w:val="en-US"/>
-              </w:rPr>
-              <w:t xml:space="preserve">       /${</w:t>
-            </w:r>
-            <w:proofErr w:type="spellStart"/>
-            <w:r>
-              <w:rPr>
-                <w:sz w:val="16"/>
-                <w:szCs w:val="16"/>
-                <w:u w:val="single"/>
-                <w:lang w:val="en-US"/>
-              </w:rPr>
-              <w:t>lp_ceo</w:t>
-            </w:r>
-            <w:proofErr w:type="spellEnd"/>
-            <w:r>
-              <w:rPr>
-                <w:sz w:val="16"/>
-                <w:szCs w:val="16"/>
-                <w:lang w:val="en-US"/>
-              </w:rPr>
-              <w:t>}/</w:t>
-            </w:r>
-          </w:p>
-          <w:p>
-            <w:pPr>
-              <w:rPr>
-                <w:sz w:val="16"/>
-                <w:szCs w:val="16"/>
-                <w:lang w:val="en-US"/>
-              </w:rPr>
-            </w:pPr>
-            <w:r>
-              <w:rPr>
-                <w:i/>
-                <w:sz w:val="16"/>
-                <w:szCs w:val="16"/>
-                <w:lang w:val="en-US"/>
-              </w:rPr>
-              <w:t xml:space="preserve">                                 </w:t>
-            </w:r>
-            <w:r>
-              <w:rPr>
-                <w:i/>
-                <w:sz w:val="16"/>
-                <w:szCs w:val="16"/>
-              </w:rPr>
-              <w:t>подпись</w:t>
-            </w:r>
-            <w:r>
-              <w:rPr>
-                <w:sz w:val="16"/>
-                <w:szCs w:val="16"/>
-                <w:lang w:val="en-US"/>
-              </w:rPr>
-              <w:t xml:space="preserve">                              </w:t>
-            </w:r>
-            <w:r>
-              <w:rPr>
-                <w:sz w:val="16"/>
-                <w:szCs w:val="16"/>
-              </w:rPr>
-              <w:t>М</w:t>
-            </w:r>
-            <w:r>
-              <w:rPr>
-                <w:sz w:val="16"/>
-                <w:szCs w:val="16"/>
-                <w:lang w:val="en-US"/>
-              </w:rPr>
-              <w:t>.</w:t>
-            </w:r>
-            <w:r>
-              <w:rPr>
-                <w:sz w:val="16"/>
-                <w:szCs w:val="16"/>
-              </w:rPr>
-              <w:t>П</w:t>
-            </w:r>
-            <w:r>
-              <w:rPr>
-                <w:sz w:val="16"/>
-                <w:szCs w:val="16"/>
-                <w:lang w:val="en-US"/>
-              </w:rPr>
-              <w:t>.</w:t>
-            </w:r>
-            <w:r>
-              <w:rPr>
-                <w:sz w:val="16"/>
-                <w:szCs w:val="16"/>
-                <w:lang w:val="en-US"/>
-              </w:rPr>
-              <w:t xml:space="preserve"> </w:t>
-            </w:r>
-            <w:r>
-              <w:rPr>
-                <w:sz w:val="16"/>
-                <w:szCs w:val="16"/>
-                <w:lang w:val="en-US"/>
-              </w:rPr>
-              <w:t>${</w:t>
-            </w:r>
-            <w:proofErr w:type="spellStart"/>
-            <w:r>
-              <w:rPr>
-                <w:sz w:val="16"/>
-                <w:szCs w:val="16"/>
-                <w:lang w:val="en-US"/>
-              </w:rPr>
-              <w:t>internal_stamp_image</w:t>
-            </w:r>
-            <w:proofErr w:type="spellEnd"/>
-            <w:r>
-              <w:rPr>
-                <w:sz w:val="16"/>
-                <w:szCs w:val="16"/>
-                <w:lang w:val="en-US"/>
               </w:rPr>
               <w:t>}</w:t>
             </w:r>
@@ -6710,11 +7054,17 @@
         </w:tc>
       </w:tr>
     </w:tbl>
-    <w:p/>
+    <w:p>
+      <w:pPr>
+        <w:rPr>
+          <w:lang w:val="en-US"/>
+        </w:rPr>
+      </w:pPr>
+    </w:p>
     <w:sectPr>
-      <w:headerReference w:type="default" r:id="rId7"/>
+      <w:footerReference w:type="default" r:id="rId8"/>
       <w:pgSz w:w="11906" w:h="16838"/>
-      <w:pgMar w:top="901" w:right="566" w:bottom="426" w:left="709" w:header="113" w:footer="567" w:gutter="0"/>
+      <w:pgMar w:top="426" w:right="566" w:bottom="426" w:left="709" w:header="113" w:footer="113" w:gutter="0"/>
       <w:cols w:space="708"/>
       <w:docGrid w:linePitch="360"/>
     </w:sectPr>
@@ -6741,6 +7091,42 @@
 </w:endnotes>
 </file>
 
+<file path=word/footer1.xml><?xml version="1.0" encoding="utf-8"?>
+<w:ftr xmlns:wpc="http://schemas.microsoft.com/office/word/2010/wordprocessingCanvas" xmlns:cx="http://schemas.microsoft.com/office/drawing/2014/chartex" xmlns:cx1="http://schemas.microsoft.com/office/drawing/2015/9/8/chartex" xmlns:cx2="http://schemas.microsoft.com/office/drawing/2015/10/21/chartex" xmlns:cx3="http://schemas.microsoft.com/office/drawing/2016/5/9/chartex" xmlns:cx4="http://schemas.microsoft.com/office/drawing/2016/5/10/chartex" xmlns:cx5="http://schemas.microsoft.com/office/drawing/2016/5/11/chartex" xmlns:cx6="http://schemas.microsoft.com/office/drawing/2016/5/12/chartex" xmlns:cx7="http://schemas.microsoft.com/office/drawing/2016/5/13/chartex" xmlns:cx8="http://schemas.microsoft.com/office/drawing/2016/5/14/chartex" xmlns:mc="http://schemas.openxmlformats.org/markup-compatibility/2006" xmlns:aink="http://schemas.microsoft.com/office/drawing/2016/ink" xmlns:am3d="http://schemas.microsoft.com/office/drawing/2017/model3d" xmlns:o="urn:schemas-microsoft-com:office:office" xmlns:oel="http://schemas.microsoft.com/office/2019/extlst" xmlns:r="http://schemas.openxmlformats.org/officeDocument/2006/relationships" xmlns:m="http://schemas.openxmlformats.org/officeDocument/2006/math" xmlns:v="urn:schemas-microsoft-com:vml" xmlns:wp14="http://schemas.microsoft.com/office/word/2010/wordprocessingDrawing" xmlns:wp="http://schemas.openxmlformats.org/drawingml/2006/wordprocessingDrawing" xmlns:w10="urn:schemas-microsoft-com:office:word" xmlns:w="http://schemas.openxmlformats.org/wordprocessingml/2006/main" xmlns:w14="http://schemas.microsoft.com/office/word/2010/wordml" xmlns:w15="http://schemas.microsoft.com/office/word/2012/wordml" xmlns:w16cex="http://schemas.microsoft.com/office/word/2018/wordml/cex" xmlns:w16cid="http://schemas.microsoft.com/office/word/2016/wordml/cid" xmlns:w16="http://schemas.microsoft.com/office/word/2018/wordml" xmlns:w16sdtdh="http://schemas.microsoft.com/office/word/2020/wordml/sdtdatahash" xmlns:w16se="http://schemas.microsoft.com/office/word/2015/wordml/symex" xmlns:wpg="http://schemas.microsoft.com/office/word/2010/wordprocessingGroup" xmlns:wpi="http://schemas.microsoft.com/office/word/2010/wordprocessingInk" xmlns:wne="http://schemas.microsoft.com/office/word/2006/wordml" xmlns:wps="http://schemas.microsoft.com/office/word/2010/wordprocessingShape" mc:Ignorable="w14 w15 w16se w16cid w16 w16cex w16sdtdh wp14">
+  <w:p>
+    <w:pPr>
+      <w:pStyle w:val="a6"/>
+      <w:jc w:val="right"/>
+    </w:pPr>
+    <w:bookmarkStart w:id="1" w:name="_Hlk232190492"/>
+    <w:r>
+      <w:rPr>
+        <w:sz w:val="20"/>
+        <w:szCs w:val="20"/>
+      </w:rPr>
+      <w:t>${</w:t>
+    </w:r>
+    <w:proofErr w:type="spellStart"/>
+    <w:r>
+      <w:rPr>
+        <w:sz w:val="20"/>
+        <w:szCs w:val="20"/>
+      </w:rPr>
+      <w:t>document_verification_code</w:t>
+    </w:r>
+    <w:proofErr w:type="spellEnd"/>
+    <w:r>
+      <w:rPr>
+        <w:sz w:val="20"/>
+        <w:szCs w:val="20"/>
+      </w:rPr>
+      <w:t>}</w:t>
+    </w:r>
+    <w:bookmarkEnd w:id="1"/>
+  </w:p>
+</w:ftr>
+</file>
+
 <file path=word/footnotes.xml><?xml version="1.0" encoding="utf-8"?>
 <w:footnotes xmlns:wpc="http://schemas.microsoft.com/office/word/2010/wordprocessingCanvas" xmlns:cx="http://schemas.microsoft.com/office/drawing/2014/chartex" xmlns:cx1="http://schemas.microsoft.com/office/drawing/2015/9/8/chartex" xmlns:cx2="http://schemas.microsoft.com/office/drawing/2015/10/21/chartex" xmlns:cx3="http://schemas.microsoft.com/office/drawing/2016/5/9/chartex" xmlns:cx4="http://schemas.microsoft.com/office/drawing/2016/5/10/chartex" xmlns:cx5="http://schemas.microsoft.com/office/drawing/2016/5/11/chartex" xmlns:cx6="http://schemas.microsoft.com/office/drawing/2016/5/12/chartex" xmlns:cx7="http://schemas.microsoft.com/office/drawing/2016/5/13/chartex" xmlns:cx8="http://schemas.microsoft.com/office/drawing/2016/5/14/chartex" xmlns:mc="http://schemas.openxmlformats.org/markup-compatibility/2006" xmlns:aink="http://schemas.microsoft.com/office/drawing/2016/ink" xmlns:am3d="http://schemas.microsoft.com/office/drawing/2017/model3d" xmlns:o="urn:schemas-microsoft-com:office:office" xmlns:oel="http://schemas.microsoft.com/office/2019/extlst" xmlns:r="http://schemas.openxmlformats.org/officeDocument/2006/relationships" xmlns:m="http://schemas.openxmlformats.org/officeDocument/2006/math" xmlns:v="urn:schemas-microsoft-com:vml" xmlns:wp14="http://schemas.microsoft.com/office/word/2010/wordprocessingDrawing" xmlns:wp="http://schemas.openxmlformats.org/drawingml/2006/wordprocessingDrawing" xmlns:w10="urn:schemas-microsoft-com:office:word" xmlns:w="http://schemas.openxmlformats.org/wordprocessingml/2006/main" xmlns:w14="http://schemas.microsoft.com/office/word/2010/wordml" xmlns:w15="http://schemas.microsoft.com/office/word/2012/wordml" xmlns:w16cex="http://schemas.microsoft.com/office/word/2018/wordml/cex" xmlns:w16cid="http://schemas.microsoft.com/office/word/2016/wordml/cid" xmlns:w16="http://schemas.microsoft.com/office/word/2018/wordml" xmlns:w16sdtdh="http://schemas.microsoft.com/office/word/2020/wordml/sdtdatahash" xmlns:w16se="http://schemas.microsoft.com/office/word/2015/wordml/symex" xmlns:wpg="http://schemas.microsoft.com/office/word/2010/wordprocessingGroup" xmlns:wpi="http://schemas.microsoft.com/office/word/2010/wordprocessingInk" xmlns:wne="http://schemas.microsoft.com/office/word/2006/wordml" xmlns:wps="http://schemas.microsoft.com/office/word/2010/wordprocessingShape" mc:Ignorable="w14 w15 w16se w16cid w16 w16cex w16sdtdh wp14">
   <w:footnote w:type="separator" w:id="-1">
@@ -6758,81 +7144,6 @@
     </w:p>
   </w:footnote>
 </w:footnotes>
-</file>
-
-<file path=word/header1.xml><?xml version="1.0" encoding="utf-8"?>
-<w:hdr xmlns:wpc="http://schemas.microsoft.com/office/word/2010/wordprocessingCanvas" xmlns:cx="http://schemas.microsoft.com/office/drawing/2014/chartex" xmlns:cx1="http://schemas.microsoft.com/office/drawing/2015/9/8/chartex" xmlns:cx2="http://schemas.microsoft.com/office/drawing/2015/10/21/chartex" xmlns:cx3="http://schemas.microsoft.com/office/drawing/2016/5/9/chartex" xmlns:cx4="http://schemas.microsoft.com/office/drawing/2016/5/10/chartex" xmlns:cx5="http://schemas.microsoft.com/office/drawing/2016/5/11/chartex" xmlns:cx6="http://schemas.microsoft.com/office/drawing/2016/5/12/chartex" xmlns:cx7="http://schemas.microsoft.com/office/drawing/2016/5/13/chartex" xmlns:cx8="http://schemas.microsoft.com/office/drawing/2016/5/14/chartex" xmlns:mc="http://schemas.openxmlformats.org/markup-compatibility/2006" xmlns:aink="http://schemas.microsoft.com/office/drawing/2016/ink" xmlns:am3d="http://schemas.microsoft.com/office/drawing/2017/model3d" xmlns:o="urn:schemas-microsoft-com:office:office" xmlns:oel="http://schemas.microsoft.com/office/2019/extlst" xmlns:r="http://schemas.openxmlformats.org/officeDocument/2006/relationships" xmlns:m="http://schemas.openxmlformats.org/officeDocument/2006/math" xmlns:v="urn:schemas-microsoft-com:vml" xmlns:wp14="http://schemas.microsoft.com/office/word/2010/wordprocessingDrawing" xmlns:wp="http://schemas.openxmlformats.org/drawingml/2006/wordprocessingDrawing" xmlns:w10="urn:schemas-microsoft-com:office:word" xmlns:w="http://schemas.openxmlformats.org/wordprocessingml/2006/main" xmlns:w14="http://schemas.microsoft.com/office/word/2010/wordml" xmlns:w15="http://schemas.microsoft.com/office/word/2012/wordml" xmlns:w16cex="http://schemas.microsoft.com/office/word/2018/wordml/cex" xmlns:w16cid="http://schemas.microsoft.com/office/word/2016/wordml/cid" xmlns:w16="http://schemas.microsoft.com/office/word/2018/wordml" xmlns:w16sdtdh="http://schemas.microsoft.com/office/word/2020/wordml/sdtdatahash" xmlns:w16se="http://schemas.microsoft.com/office/word/2015/wordml/symex" xmlns:wpg="http://schemas.microsoft.com/office/word/2010/wordprocessingGroup" xmlns:wpi="http://schemas.microsoft.com/office/word/2010/wordprocessingInk" xmlns:wne="http://schemas.microsoft.com/office/word/2006/wordml" xmlns:wps="http://schemas.microsoft.com/office/word/2010/wordprocessingShape" mc:Ignorable="w14 w15 w16se w16cid w16 w16cex w16sdtdh wp14">
-  <w:p>
-    <w:pPr>
-      <w:pStyle w:val="a4"/>
-    </w:pPr>
-    <w:r>
-      <w:rPr>
-        <w:noProof/>
-      </w:rPr>
-      <w:drawing>
-        <wp:anchor distT="0" distB="0" distL="114300" distR="114300" simplePos="0" relativeHeight="251658240" behindDoc="0" locked="0" layoutInCell="1" allowOverlap="1" wp14:anchorId="33367578" wp14:editId="4B455D07">
-          <wp:simplePos x="0" y="0"/>
-          <wp:positionH relativeFrom="column">
-            <wp:posOffset>-1962</wp:posOffset>
-          </wp:positionH>
-          <wp:positionV relativeFrom="paragraph">
-            <wp:posOffset>3308</wp:posOffset>
-          </wp:positionV>
-          <wp:extent cx="1460311" cy="486770"/>
-          <wp:effectExtent l="0" t="0" r="6985" b="0"/>
-          <wp:wrapNone/>
-          <wp:docPr id="3" name="Рисунок 3"/>
-          <wp:cNvGraphicFramePr>
-            <a:graphicFrameLocks xmlns:a="http://schemas.openxmlformats.org/drawingml/2006/main" noChangeAspect="1"/>
-          </wp:cNvGraphicFramePr>
-          <a:graphic xmlns:a="http://schemas.openxmlformats.org/drawingml/2006/main">
-            <a:graphicData uri="http://schemas.openxmlformats.org/drawingml/2006/picture">
-              <pic:pic xmlns:pic="http://schemas.openxmlformats.org/drawingml/2006/picture">
-                <pic:nvPicPr>
-                  <pic:cNvPr id="1" name="Рисунок 1"/>
-                  <pic:cNvPicPr/>
-                </pic:nvPicPr>
-                <pic:blipFill>
-                  <a:blip r:embed="rId1">
-                    <a:extLst>
-                      <a:ext uri="{28A0092B-C50C-407E-A947-70E740481C1C}">
-                        <a14:useLocalDpi xmlns:a14="http://schemas.microsoft.com/office/drawing/2010/main" val="0"/>
-                      </a:ext>
-                    </a:extLst>
-                  </a:blip>
-                  <a:stretch>
-                    <a:fillRect/>
-                  </a:stretch>
-                </pic:blipFill>
-                <pic:spPr>
-                  <a:xfrm>
-                    <a:off x="0" y="0"/>
-                    <a:ext cx="1460311" cy="486770"/>
-                  </a:xfrm>
-                  <a:prstGeom prst="rect">
-                    <a:avLst/>
-                  </a:prstGeom>
-                </pic:spPr>
-              </pic:pic>
-            </a:graphicData>
-          </a:graphic>
-          <wp14:sizeRelH relativeFrom="page">
-            <wp14:pctWidth>0</wp14:pctWidth>
-          </wp14:sizeRelH>
-          <wp14:sizeRelV relativeFrom="page">
-            <wp14:pctHeight>0</wp14:pctHeight>
-          </wp14:sizeRelV>
-        </wp:anchor>
-      </w:drawing>
-    </w:r>
-  </w:p>
-  <w:p>
-    <w:pPr>
-      <w:pStyle w:val="a4"/>
-    </w:pPr>
-  </w:p>
-</w:hdr>
 </file>
 
 <file path=word/numbering.xml><?xml version="1.0" encoding="utf-8"?>
@@ -7491,6 +7802,18 @@
       <w:lang w:eastAsia="ru-RU"/>
     </w:rPr>
   </w:style>
+  <w:style w:type="character" w:styleId="aa">
+    <w:name w:val="Unresolved Mention"/>
+    <w:basedOn w:val="a0"/>
+    <w:uiPriority w:val="99"/>
+    <w:semiHidden/>
+    <w:unhideWhenUsed/>
+    <w:rsid w:val="00FA201F"/>
+    <w:rPr>
+      <w:color w:val="605E5C"/>
+      <w:shd w:val="clear" w:color="auto" w:fill="E1DFDD"/>
+    </w:rPr>
+  </w:style>
 </w:styles>
 </file>
 

</xml_diff>